<commit_message>
test: adiciona testes unitários + integracao
</commit_message>
<xml_diff>
--- a/test/Plano_testes.docx
+++ b/test/Plano_testes.docx
@@ -7,15 +7,6 @@
         <w:pStyle w:val="MdHeading2"/>
       </w:pPr>
       <w:r>
-        <w:rPr>
-          <w:u w:val="single"/>
-        </w:rPr>
-        <w:t>Plano</w:t>
-      </w:r>
-      <w:r>
-        <w:t xml:space="preserve"> de </w:t>
-      </w:r>
-      <w:r>
         <w:t xml:space="preserve">Casos de Teste </w:t>
       </w:r>
     </w:p>
@@ -30,7 +21,13 @@
         <w:pStyle w:val="MdHeading3"/>
       </w:pPr>
       <w:r>
-        <w:t>1. Gestão de Clientes e Pets</w:t>
+        <w:t>1</w:t>
+      </w:r>
+      <w:r>
+        <w:t xml:space="preserve">. </w:t>
+      </w:r>
+      <w:r>
+        <w:t>Testes Unitários</w:t>
       </w:r>
     </w:p>
     <w:tbl>
@@ -50,9 +47,9 @@
       </w:tblPr>
       <w:tblGrid>
         <w:gridCol w:w="719"/>
-        <w:gridCol w:w="1629"/>
-        <w:gridCol w:w="2191"/>
-        <w:gridCol w:w="3024"/>
+        <w:gridCol w:w="1922"/>
+        <w:gridCol w:w="2532"/>
+        <w:gridCol w:w="2390"/>
         <w:gridCol w:w="1463"/>
       </w:tblGrid>
       <w:tr>
@@ -186,76 +183,73 @@
               <w:rPr>
                 <w:rStyle w:val="MdStrong"/>
               </w:rPr>
-              <w:t>CT01</w:t>
-            </w:r>
-          </w:p>
-        </w:tc>
-        <w:tc>
-          <w:tcPr>
-            <w:tcW w:w="0" w:type="auto"/>
-            <w:tcMar>
-              <w:top w:w="80" w:type="dxa"/>
-              <w:left w:w="120" w:type="dxa"/>
-              <w:bottom w:w="80" w:type="dxa"/>
-              <w:right w:w="120" w:type="dxa"/>
-            </w:tcMar>
-            <w:vAlign w:val="center"/>
-          </w:tcPr>
-          <w:p>
-            <w:pPr>
-              <w:pStyle w:val="MdTableCell"/>
-            </w:pPr>
-            <w:r>
-              <w:t>Cadastro de Cliente Válido (Positivo)</w:t>
-            </w:r>
-          </w:p>
-        </w:tc>
-        <w:tc>
-          <w:tcPr>
-            <w:tcW w:w="0" w:type="auto"/>
-            <w:tcMar>
-              <w:top w:w="80" w:type="dxa"/>
-              <w:left w:w="120" w:type="dxa"/>
-              <w:bottom w:w="80" w:type="dxa"/>
-              <w:right w:w="120" w:type="dxa"/>
-            </w:tcMar>
-            <w:vAlign w:val="center"/>
-          </w:tcPr>
-          <w:p>
-            <w:pPr>
-              <w:pStyle w:val="MdTableCell"/>
-            </w:pPr>
-            <w:r>
-              <w:t xml:space="preserve">Tentar cadastrar um cliente fornecendo apenas o campo obrigatório </w:t>
-            </w:r>
-            <w:r>
-              <w:rPr>
-                <w:u w:val="single"/>
-              </w:rPr>
-              <w:t>nome</w:t>
-            </w:r>
-            <w:r>
-              <w:t>.</w:t>
-            </w:r>
-          </w:p>
-        </w:tc>
-        <w:tc>
-          <w:tcPr>
-            <w:tcW w:w="0" w:type="auto"/>
-            <w:tcMar>
-              <w:top w:w="80" w:type="dxa"/>
-              <w:left w:w="120" w:type="dxa"/>
-              <w:bottom w:w="80" w:type="dxa"/>
-              <w:right w:w="120" w:type="dxa"/>
-            </w:tcMar>
-            <w:vAlign w:val="center"/>
-          </w:tcPr>
-          <w:p>
-            <w:pPr>
-              <w:pStyle w:val="MdTableCell"/>
-            </w:pPr>
-            <w:r>
-              <w:t>O cliente deve ser salvo no banco de dados com sucesso e um ID único deve ser gerado.</w:t>
+              <w:t>CT0</w:t>
+            </w:r>
+            <w:r>
+              <w:rPr>
+                <w:rStyle w:val="MdStrong"/>
+              </w:rPr>
+              <w:t>1</w:t>
+            </w:r>
+          </w:p>
+        </w:tc>
+        <w:tc>
+          <w:tcPr>
+            <w:tcW w:w="0" w:type="auto"/>
+            <w:tcMar>
+              <w:top w:w="80" w:type="dxa"/>
+              <w:left w:w="120" w:type="dxa"/>
+              <w:bottom w:w="80" w:type="dxa"/>
+              <w:right w:w="120" w:type="dxa"/>
+            </w:tcMar>
+            <w:vAlign w:val="center"/>
+          </w:tcPr>
+          <w:p>
+            <w:pPr>
+              <w:pStyle w:val="MdTableCell"/>
+            </w:pPr>
+            <w:r>
+              <w:t>Criação de um plano Semanal com banhos às terças-feiras em Maio de 2024.</w:t>
+            </w:r>
+          </w:p>
+        </w:tc>
+        <w:tc>
+          <w:tcPr>
+            <w:tcW w:w="0" w:type="auto"/>
+            <w:tcMar>
+              <w:top w:w="80" w:type="dxa"/>
+              <w:left w:w="120" w:type="dxa"/>
+              <w:bottom w:w="80" w:type="dxa"/>
+              <w:right w:w="120" w:type="dxa"/>
+            </w:tcMar>
+            <w:vAlign w:val="center"/>
+          </w:tcPr>
+          <w:p>
+            <w:pPr>
+              <w:pStyle w:val="MdTableCell"/>
+            </w:pPr>
+            <w:r>
+              <w:t>Verifica se a função identifica corretamente a primeira terça-feira do mês (dia 07/05) e gera as 3 semanas seguintes consecutivas.</w:t>
+            </w:r>
+          </w:p>
+        </w:tc>
+        <w:tc>
+          <w:tcPr>
+            <w:tcW w:w="0" w:type="auto"/>
+            <w:tcMar>
+              <w:top w:w="80" w:type="dxa"/>
+              <w:left w:w="120" w:type="dxa"/>
+              <w:bottom w:w="80" w:type="dxa"/>
+              <w:right w:w="120" w:type="dxa"/>
+            </w:tcMar>
+            <w:vAlign w:val="center"/>
+          </w:tcPr>
+          <w:p>
+            <w:pPr>
+              <w:pStyle w:val="MdTableCell"/>
+            </w:pPr>
+            <w:r>
+              <w:t> Uma lista com exatamente 4 datas: 07/05, 14/05, 21/05 e 28/05 de 2024.</w:t>
             </w:r>
           </w:p>
         </w:tc>
@@ -291,6 +285,364 @@
         <w:tc>
           <w:tcPr>
             <w:tcW w:w="0" w:type="auto"/>
+            <w:tcMar>
+              <w:top w:w="80" w:type="dxa"/>
+              <w:left w:w="120" w:type="dxa"/>
+              <w:bottom w:w="80" w:type="dxa"/>
+              <w:right w:w="120" w:type="dxa"/>
+            </w:tcMar>
+            <w:vAlign w:val="center"/>
+          </w:tcPr>
+          <w:p>
+            <w:pPr>
+              <w:pStyle w:val="MdTableCell"/>
+              <w:rPr>
+                <w:b/>
+                <w:bCs/>
+              </w:rPr>
+            </w:pPr>
+            <w:r>
+              <w:rPr>
+                <w:rStyle w:val="MdStrong"/>
+              </w:rPr>
+              <w:t>CT</w:t>
+            </w:r>
+            <w:r>
+              <w:rPr>
+                <w:rStyle w:val="MdStrong"/>
+              </w:rPr>
+              <w:t>02</w:t>
+            </w:r>
+          </w:p>
+        </w:tc>
+        <w:tc>
+          <w:tcPr>
+            <w:tcW w:w="0" w:type="auto"/>
+            <w:tcMar>
+              <w:top w:w="80" w:type="dxa"/>
+              <w:left w:w="120" w:type="dxa"/>
+              <w:bottom w:w="80" w:type="dxa"/>
+              <w:right w:w="120" w:type="dxa"/>
+            </w:tcMar>
+            <w:vAlign w:val="center"/>
+          </w:tcPr>
+          <w:p>
+            <w:pPr>
+              <w:pStyle w:val="MdTableCell"/>
+            </w:pPr>
+            <w:r>
+              <w:t>Criação de um plano Quinzenal com banhos às quartas-feiras em Maio de 2024.</w:t>
+            </w:r>
+          </w:p>
+        </w:tc>
+        <w:tc>
+          <w:tcPr>
+            <w:tcW w:w="0" w:type="auto"/>
+            <w:tcMar>
+              <w:top w:w="80" w:type="dxa"/>
+              <w:left w:w="120" w:type="dxa"/>
+              <w:bottom w:w="80" w:type="dxa"/>
+              <w:right w:w="120" w:type="dxa"/>
+            </w:tcMar>
+            <w:vAlign w:val="center"/>
+          </w:tcPr>
+          <w:p>
+            <w:pPr>
+              <w:pStyle w:val="MdTableCell"/>
+            </w:pPr>
+            <w:r>
+              <w:t>Valida se o sistema encontra a primeira quarta-feira (dia 01/05) e calcula a próxima ocorrência exatamente 15 dias depois.</w:t>
+            </w:r>
+          </w:p>
+        </w:tc>
+        <w:tc>
+          <w:tcPr>
+            <w:tcW w:w="0" w:type="auto"/>
+            <w:tcMar>
+              <w:top w:w="80" w:type="dxa"/>
+              <w:left w:w="120" w:type="dxa"/>
+              <w:bottom w:w="80" w:type="dxa"/>
+              <w:right w:w="120" w:type="dxa"/>
+            </w:tcMar>
+            <w:vAlign w:val="center"/>
+          </w:tcPr>
+          <w:p>
+            <w:pPr>
+              <w:pStyle w:val="MdTableCell"/>
+            </w:pPr>
+            <w:r>
+              <w:t>: Uma lista com exatamente 2 datas: 01/05 e 16/05 de 2024.</w:t>
+            </w:r>
+          </w:p>
+        </w:tc>
+        <w:tc>
+          <w:tcPr>
+            <w:tcW w:w="0" w:type="auto"/>
+            <w:tcMar>
+              <w:top w:w="80" w:type="dxa"/>
+              <w:left w:w="120" w:type="dxa"/>
+              <w:bottom w:w="80" w:type="dxa"/>
+              <w:right w:w="120" w:type="dxa"/>
+            </w:tcMar>
+            <w:vAlign w:val="center"/>
+          </w:tcPr>
+          <w:p>
+            <w:pPr>
+              <w:pStyle w:val="MdTableCell"/>
+            </w:pPr>
+            <w:r>
+              <w:rPr>
+                <w:rStyle w:val="MdStrong"/>
+              </w:rPr>
+              <w:t>Unitário</w:t>
+            </w:r>
+          </w:p>
+        </w:tc>
+      </w:tr>
+      <w:tr>
+        <w:trPr>
+          <w:cantSplit/>
+          <w:trHeight w:val="576"/>
+        </w:trPr>
+        <w:tc>
+          <w:tcPr>
+            <w:tcW w:w="0" w:type="auto"/>
+            <w:tcMar>
+              <w:top w:w="80" w:type="dxa"/>
+              <w:left w:w="120" w:type="dxa"/>
+              <w:bottom w:w="80" w:type="dxa"/>
+              <w:right w:w="120" w:type="dxa"/>
+            </w:tcMar>
+            <w:vAlign w:val="center"/>
+          </w:tcPr>
+          <w:p>
+            <w:pPr>
+              <w:pStyle w:val="MdTableCell"/>
+              <w:rPr>
+                <w:rStyle w:val="MdStrong"/>
+              </w:rPr>
+            </w:pPr>
+            <w:r>
+              <w:rPr>
+                <w:rStyle w:val="MdStrong"/>
+              </w:rPr>
+              <w:t>CT03</w:t>
+            </w:r>
+          </w:p>
+        </w:tc>
+        <w:tc>
+          <w:tcPr>
+            <w:tcW w:w="0" w:type="auto"/>
+            <w:tcMar>
+              <w:top w:w="80" w:type="dxa"/>
+              <w:left w:w="120" w:type="dxa"/>
+              <w:bottom w:w="80" w:type="dxa"/>
+              <w:right w:w="120" w:type="dxa"/>
+            </w:tcMar>
+            <w:vAlign w:val="center"/>
+          </w:tcPr>
+          <w:p>
+            <w:pPr>
+              <w:pStyle w:val="MdTableCell"/>
+            </w:pPr>
+            <w:r>
+              <w:t>Criação de um plano Mensal com banho aos sábados em Junho de 2024.</w:t>
+            </w:r>
+          </w:p>
+        </w:tc>
+        <w:tc>
+          <w:tcPr>
+            <w:tcW w:w="0" w:type="auto"/>
+            <w:tcMar>
+              <w:top w:w="80" w:type="dxa"/>
+              <w:left w:w="120" w:type="dxa"/>
+              <w:bottom w:w="80" w:type="dxa"/>
+              <w:right w:w="120" w:type="dxa"/>
+            </w:tcMar>
+            <w:vAlign w:val="center"/>
+          </w:tcPr>
+          <w:p>
+            <w:pPr>
+              <w:pStyle w:val="MdTableCell"/>
+            </w:pPr>
+            <w:r>
+              <w:t>Garante que para o plano mensal, apenas a primeira ocorrência daquele dia da semana no mês seja agendada.</w:t>
+            </w:r>
+          </w:p>
+        </w:tc>
+        <w:tc>
+          <w:tcPr>
+            <w:tcW w:w="0" w:type="auto"/>
+            <w:tcMar>
+              <w:top w:w="80" w:type="dxa"/>
+              <w:left w:w="120" w:type="dxa"/>
+              <w:bottom w:w="80" w:type="dxa"/>
+              <w:right w:w="120" w:type="dxa"/>
+            </w:tcMar>
+            <w:vAlign w:val="center"/>
+          </w:tcPr>
+          <w:p>
+            <w:pPr>
+              <w:pStyle w:val="MdTableCell"/>
+            </w:pPr>
+            <w:r>
+              <w:t>Uma lista com apenas 1 data: 01/06/2024 (o primeiro sábado de junho).</w:t>
+            </w:r>
+          </w:p>
+        </w:tc>
+        <w:tc>
+          <w:tcPr>
+            <w:tcW w:w="0" w:type="auto"/>
+            <w:tcMar>
+              <w:top w:w="80" w:type="dxa"/>
+              <w:left w:w="120" w:type="dxa"/>
+              <w:bottom w:w="80" w:type="dxa"/>
+              <w:right w:w="120" w:type="dxa"/>
+            </w:tcMar>
+            <w:vAlign w:val="center"/>
+          </w:tcPr>
+          <w:p>
+            <w:pPr>
+              <w:pStyle w:val="MdTableCell"/>
+              <w:rPr>
+                <w:rStyle w:val="MdStrong"/>
+              </w:rPr>
+            </w:pPr>
+            <w:r>
+              <w:rPr>
+                <w:rStyle w:val="MdStrong"/>
+              </w:rPr>
+              <w:t>Unitário</w:t>
+            </w:r>
+          </w:p>
+        </w:tc>
+      </w:tr>
+      <w:tr>
+        <w:trPr>
+          <w:cantSplit/>
+          <w:trHeight w:val="576"/>
+        </w:trPr>
+        <w:tc>
+          <w:tcPr>
+            <w:tcW w:w="0" w:type="auto"/>
+            <w:tcMar>
+              <w:top w:w="80" w:type="dxa"/>
+              <w:left w:w="120" w:type="dxa"/>
+              <w:bottom w:w="80" w:type="dxa"/>
+              <w:right w:w="120" w:type="dxa"/>
+            </w:tcMar>
+            <w:vAlign w:val="center"/>
+          </w:tcPr>
+          <w:p>
+            <w:pPr>
+              <w:pStyle w:val="MdTableCell"/>
+              <w:rPr>
+                <w:rStyle w:val="MdStrong"/>
+              </w:rPr>
+            </w:pPr>
+            <w:r>
+              <w:rPr>
+                <w:rStyle w:val="MdStrong"/>
+              </w:rPr>
+              <w:t>CT04</w:t>
+            </w:r>
+          </w:p>
+        </w:tc>
+        <w:tc>
+          <w:tcPr>
+            <w:tcW w:w="0" w:type="auto"/>
+            <w:tcMar>
+              <w:top w:w="80" w:type="dxa"/>
+              <w:left w:w="120" w:type="dxa"/>
+              <w:bottom w:w="80" w:type="dxa"/>
+              <w:right w:w="120" w:type="dxa"/>
+            </w:tcMar>
+            <w:vAlign w:val="center"/>
+          </w:tcPr>
+          <w:p>
+            <w:pPr>
+              <w:pStyle w:val="MdTableCell"/>
+            </w:pPr>
+            <w:r>
+              <w:t>Geração de agendamentos em um mês curto (Fevereiro de 2024 - bissexto).</w:t>
+            </w:r>
+          </w:p>
+        </w:tc>
+        <w:tc>
+          <w:tcPr>
+            <w:tcW w:w="0" w:type="auto"/>
+            <w:tcMar>
+              <w:top w:w="80" w:type="dxa"/>
+              <w:left w:w="120" w:type="dxa"/>
+              <w:bottom w:w="80" w:type="dxa"/>
+              <w:right w:w="120" w:type="dxa"/>
+            </w:tcMar>
+            <w:vAlign w:val="center"/>
+          </w:tcPr>
+          <w:p>
+            <w:pPr>
+              <w:pStyle w:val="MdTableCell"/>
+            </w:pPr>
+            <w:r>
+              <w:t>Testa o mecanismo de segurança que impede que banhos "transbordem" para o mês seguinte. Se o cálculo de 7 em 7 dias cair em Março, essa data deve ser descartada.</w:t>
+            </w:r>
+          </w:p>
+        </w:tc>
+        <w:tc>
+          <w:tcPr>
+            <w:tcW w:w="0" w:type="auto"/>
+            <w:tcMar>
+              <w:top w:w="80" w:type="dxa"/>
+              <w:left w:w="120" w:type="dxa"/>
+              <w:bottom w:w="80" w:type="dxa"/>
+              <w:right w:w="120" w:type="dxa"/>
+            </w:tcMar>
+            <w:vAlign w:val="center"/>
+          </w:tcPr>
+          <w:p>
+            <w:pPr>
+              <w:pStyle w:val="MdTableCell"/>
+            </w:pPr>
+            <w:r>
+              <w:t>Todas as datas retornadas devem obrigatoriamente pertencer ao mês 2 (fevereiro) e ao ano de 2024.</w:t>
+            </w:r>
+          </w:p>
+        </w:tc>
+        <w:tc>
+          <w:tcPr>
+            <w:tcW w:w="0" w:type="auto"/>
+            <w:tcMar>
+              <w:top w:w="80" w:type="dxa"/>
+              <w:left w:w="120" w:type="dxa"/>
+              <w:bottom w:w="80" w:type="dxa"/>
+              <w:right w:w="120" w:type="dxa"/>
+            </w:tcMar>
+            <w:vAlign w:val="center"/>
+          </w:tcPr>
+          <w:p>
+            <w:pPr>
+              <w:pStyle w:val="MdTableCell"/>
+              <w:rPr>
+                <w:rStyle w:val="MdStrong"/>
+              </w:rPr>
+            </w:pPr>
+            <w:r>
+              <w:rPr>
+                <w:rStyle w:val="MdStrong"/>
+              </w:rPr>
+              <w:t>Unitário</w:t>
+            </w:r>
+          </w:p>
+        </w:tc>
+      </w:tr>
+      <w:tr>
+        <w:trPr>
+          <w:cantSplit/>
+          <w:trHeight w:val="576"/>
+        </w:trPr>
+        <w:tc>
+          <w:tcPr>
+            <w:tcW w:w="0" w:type="auto"/>
             <w:tcBorders>
               <w:bottom w:val="single" w:sz="4" w:space="0" w:color="E1E4E8"/>
             </w:tcBorders>
@@ -305,12 +657,15 @@
           <w:p>
             <w:pPr>
               <w:pStyle w:val="MdTableCell"/>
-            </w:pPr>
-            <w:r>
-              <w:rPr>
-                <w:rStyle w:val="MdStrong"/>
-              </w:rPr>
-              <w:t>CT02</w:t>
+              <w:rPr>
+                <w:rStyle w:val="MdStrong"/>
+              </w:rPr>
+            </w:pPr>
+            <w:r>
+              <w:rPr>
+                <w:rStyle w:val="MdStrong"/>
+              </w:rPr>
+              <w:t>CT05</w:t>
             </w:r>
           </w:p>
         </w:tc>
@@ -333,7 +688,7 @@
               <w:pStyle w:val="MdTableCell"/>
             </w:pPr>
             <w:r>
-              <w:t>Cadastro de Cliente sem Nome (Negativo)</w:t>
+              <w:t>Cálculo do valor total do pacote baseado no valor unitário do banho e no tipo de plano.</w:t>
             </w:r>
           </w:p>
         </w:tc>
@@ -356,16 +711,31 @@
               <w:pStyle w:val="MdTableCell"/>
             </w:pPr>
             <w:r>
-              <w:t xml:space="preserve">Tentar cadastrar um cliente enviando o campo </w:t>
-            </w:r>
-            <w:r>
-              <w:rPr>
-                <w:u w:val="single"/>
-              </w:rPr>
-              <w:t>nome</w:t>
-            </w:r>
-            <w:r>
-              <w:t xml:space="preserve"> vazio ou nulo.</w:t>
+              <w:t>Valida a regra matemática:</w:t>
+            </w:r>
+          </w:p>
+          <w:p>
+            <w:pPr>
+              <w:pStyle w:val="MdTableCell"/>
+            </w:pPr>
+            <w:r>
+              <w:t>Semanal: Valor Base × 4.</w:t>
+            </w:r>
+          </w:p>
+          <w:p>
+            <w:pPr>
+              <w:pStyle w:val="MdTableCell"/>
+            </w:pPr>
+            <w:r>
+              <w:t>Quinzenal: Valor Base × 2.</w:t>
+            </w:r>
+          </w:p>
+          <w:p>
+            <w:pPr>
+              <w:pStyle w:val="MdTableCell"/>
+            </w:pPr>
+            <w:r>
+              <w:t>Mensal: Valor Base × 1.</w:t>
             </w:r>
           </w:p>
         </w:tc>
@@ -388,15 +758,7 @@
               <w:pStyle w:val="MdTableCell"/>
             </w:pPr>
             <w:r>
-              <w:t xml:space="preserve">O sistema deve retornar um erro de validação (422 </w:t>
-            </w:r>
-            <w:proofErr w:type="spellStart"/>
-            <w:r>
-              <w:t>Unprocessable</w:t>
-            </w:r>
-            <w:proofErr w:type="spellEnd"/>
-            <w:r>
-              <w:t xml:space="preserve"> Entity) informando que o nome é obrigatório.</w:t>
+              <w:t>Valores calculados corretamente (ex: R$ 50,00 semanal vira R$ 200,00) e retorno de 0.0 para planos com nomes inválidos.</w:t>
             </w:r>
           </w:p>
         </w:tc>
@@ -417,6 +779,9 @@
           <w:p>
             <w:pPr>
               <w:pStyle w:val="MdTableCell"/>
+              <w:rPr>
+                <w:rStyle w:val="MdStrong"/>
+              </w:rPr>
             </w:pPr>
             <w:r>
               <w:rPr>
@@ -433,7 +798,56 @@
         <w:pStyle w:val="MdHeading3"/>
       </w:pPr>
       <w:r>
-        <w:t>2. Controle de Pacotes Mensais</w:t>
+        <w:lastRenderedPageBreak/>
+        <w:drawing>
+          <wp:inline distT="0" distB="0" distL="0" distR="0" wp14:anchorId="69863C53" wp14:editId="6D99358B">
+            <wp:extent cx="5731510" cy="1565910"/>
+            <wp:effectExtent l="0" t="0" r="2540" b="0"/>
+            <wp:docPr id="1193947463" name="Imagem 1"/>
+            <wp:cNvGraphicFramePr>
+              <a:graphicFrameLocks xmlns:a="http://schemas.openxmlformats.org/drawingml/2006/main" noChangeAspect="1"/>
+            </wp:cNvGraphicFramePr>
+            <a:graphic xmlns:a="http://schemas.openxmlformats.org/drawingml/2006/main">
+              <a:graphicData uri="http://schemas.openxmlformats.org/drawingml/2006/picture">
+                <pic:pic xmlns:pic="http://schemas.openxmlformats.org/drawingml/2006/picture">
+                  <pic:nvPicPr>
+                    <pic:cNvPr id="1193947463" name=""/>
+                    <pic:cNvPicPr/>
+                  </pic:nvPicPr>
+                  <pic:blipFill>
+                    <a:blip r:embed="rId5"/>
+                    <a:stretch>
+                      <a:fillRect/>
+                    </a:stretch>
+                  </pic:blipFill>
+                  <pic:spPr>
+                    <a:xfrm>
+                      <a:off x="0" y="0"/>
+                      <a:ext cx="5731510" cy="1565910"/>
+                    </a:xfrm>
+                    <a:prstGeom prst="rect">
+                      <a:avLst/>
+                    </a:prstGeom>
+                  </pic:spPr>
+                </pic:pic>
+              </a:graphicData>
+            </a:graphic>
+          </wp:inline>
+        </w:drawing>
+      </w:r>
+    </w:p>
+    <w:p>
+      <w:pPr>
+        <w:pStyle w:val="MdHeading3"/>
+      </w:pPr>
+      <w:r>
+        <w:t>2</w:t>
+      </w:r>
+      <w:r>
+        <w:t xml:space="preserve">. </w:t>
+      </w:r>
+      <w:r>
+        <w:t>Testes de Integração</w:t>
       </w:r>
     </w:p>
     <w:tbl>
@@ -453,9 +867,9 @@
       </w:tblPr>
       <w:tblGrid>
         <w:gridCol w:w="718"/>
-        <w:gridCol w:w="1984"/>
-        <w:gridCol w:w="1955"/>
-        <w:gridCol w:w="2906"/>
+        <w:gridCol w:w="1435"/>
+        <w:gridCol w:w="2415"/>
+        <w:gridCol w:w="2995"/>
         <w:gridCol w:w="1463"/>
       </w:tblGrid>
       <w:tr>
@@ -506,7 +920,7 @@
         </w:tc>
         <w:tc>
           <w:tcPr>
-            <w:tcW w:w="0" w:type="auto"/>
+            <w:tcW w:w="1338" w:type="pct"/>
             <w:tcMar>
               <w:top w:w="100" w:type="dxa"/>
               <w:left w:w="120" w:type="dxa"/>
@@ -526,7 +940,7 @@
         </w:tc>
         <w:tc>
           <w:tcPr>
-            <w:tcW w:w="0" w:type="auto"/>
+            <w:tcW w:w="1659" w:type="pct"/>
             <w:tcMar>
               <w:top w:w="100" w:type="dxa"/>
               <w:left w:w="120" w:type="dxa"/>
@@ -546,7 +960,7 @@
         </w:tc>
         <w:tc>
           <w:tcPr>
-            <w:tcW w:w="0" w:type="auto"/>
+            <w:tcW w:w="810" w:type="pct"/>
             <w:tcMar>
               <w:top w:w="100" w:type="dxa"/>
               <w:left w:w="120" w:type="dxa"/>
@@ -589,73 +1003,115 @@
               <w:rPr>
                 <w:rStyle w:val="MdStrong"/>
               </w:rPr>
-              <w:t>CT03</w:t>
-            </w:r>
-          </w:p>
-        </w:tc>
-        <w:tc>
-          <w:tcPr>
-            <w:tcW w:w="0" w:type="auto"/>
-            <w:tcMar>
-              <w:top w:w="80" w:type="dxa"/>
-              <w:left w:w="120" w:type="dxa"/>
-              <w:bottom w:w="80" w:type="dxa"/>
-              <w:right w:w="120" w:type="dxa"/>
-            </w:tcMar>
-            <w:vAlign w:val="center"/>
-          </w:tcPr>
-          <w:p>
-            <w:pPr>
-              <w:pStyle w:val="MdTableCell"/>
-            </w:pPr>
-            <w:r>
-              <w:t>Criação de Pacote com Geração de Agendamentos (Positivo)</w:t>
-            </w:r>
-          </w:p>
-        </w:tc>
-        <w:tc>
-          <w:tcPr>
-            <w:tcW w:w="0" w:type="auto"/>
-            <w:tcMar>
-              <w:top w:w="80" w:type="dxa"/>
-              <w:left w:w="120" w:type="dxa"/>
-              <w:bottom w:w="80" w:type="dxa"/>
-              <w:right w:w="120" w:type="dxa"/>
-            </w:tcMar>
-            <w:vAlign w:val="center"/>
-          </w:tcPr>
-          <w:p>
-            <w:pPr>
-              <w:pStyle w:val="MdTableCell"/>
-            </w:pPr>
-            <w:r>
-              <w:t>Criar um pacote para um cachorro existente, definindo o tipo de plano e valor.</w:t>
-            </w:r>
-          </w:p>
-        </w:tc>
-        <w:tc>
-          <w:tcPr>
-            <w:tcW w:w="0" w:type="auto"/>
-            <w:tcMar>
-              <w:top w:w="80" w:type="dxa"/>
-              <w:left w:w="120" w:type="dxa"/>
-              <w:bottom w:w="80" w:type="dxa"/>
-              <w:right w:w="120" w:type="dxa"/>
-            </w:tcMar>
-            <w:vAlign w:val="center"/>
-          </w:tcPr>
-          <w:p>
-            <w:pPr>
-              <w:pStyle w:val="MdTableCell"/>
-            </w:pPr>
-            <w:r>
-              <w:t>O pacote deve ser criado e o sistema deve gerar automaticamente os agendamentos correspondentes para os próximos 3 meses.</w:t>
-            </w:r>
-          </w:p>
-        </w:tc>
-        <w:tc>
-          <w:tcPr>
-            <w:tcW w:w="0" w:type="auto"/>
+              <w:t>C</w:t>
+            </w:r>
+            <w:r>
+              <w:rPr>
+                <w:rStyle w:val="MdStrong"/>
+              </w:rPr>
+              <w:t>T0</w:t>
+            </w:r>
+            <w:r>
+              <w:rPr>
+                <w:rStyle w:val="MdStrong"/>
+              </w:rPr>
+              <w:t>6</w:t>
+            </w:r>
+          </w:p>
+        </w:tc>
+        <w:tc>
+          <w:tcPr>
+            <w:tcW w:w="0" w:type="auto"/>
+            <w:tcMar>
+              <w:top w:w="80" w:type="dxa"/>
+              <w:left w:w="120" w:type="dxa"/>
+              <w:bottom w:w="80" w:type="dxa"/>
+              <w:right w:w="120" w:type="dxa"/>
+            </w:tcMar>
+            <w:vAlign w:val="center"/>
+          </w:tcPr>
+          <w:p>
+            <w:pPr>
+              <w:pStyle w:val="MdTableCell"/>
+            </w:pPr>
+            <w:r>
+              <w:t>Cadastro de um novo cliente com dados mínimos válidos.</w:t>
+            </w:r>
+            <w:r>
+              <w:t xml:space="preserve"> </w:t>
+            </w:r>
+            <w:r>
+              <w:t>(Positivo)</w:t>
+            </w:r>
+          </w:p>
+        </w:tc>
+        <w:tc>
+          <w:tcPr>
+            <w:tcW w:w="1338" w:type="pct"/>
+            <w:tcMar>
+              <w:top w:w="80" w:type="dxa"/>
+              <w:left w:w="120" w:type="dxa"/>
+              <w:bottom w:w="80" w:type="dxa"/>
+              <w:right w:w="120" w:type="dxa"/>
+            </w:tcMar>
+            <w:vAlign w:val="center"/>
+          </w:tcPr>
+          <w:p>
+            <w:pPr>
+              <w:pStyle w:val="MdTableCell"/>
+            </w:pPr>
+            <w:r>
+              <w:t>O teste envia uma requisição POST para o endpoint de criação de clientes com apenas o nome do cliente. Em seguida, ele faz uma requisição GET para o endpoint de obtenção de cliente para verificar se o cliente foi persistido corretamente no banco de dados e se os dados retornados estão corretos.</w:t>
+            </w:r>
+          </w:p>
+        </w:tc>
+        <w:tc>
+          <w:tcPr>
+            <w:tcW w:w="1659" w:type="pct"/>
+            <w:tcMar>
+              <w:top w:w="80" w:type="dxa"/>
+              <w:left w:w="120" w:type="dxa"/>
+              <w:bottom w:w="80" w:type="dxa"/>
+              <w:right w:w="120" w:type="dxa"/>
+            </w:tcMar>
+            <w:vAlign w:val="center"/>
+          </w:tcPr>
+          <w:p>
+            <w:pPr>
+              <w:pStyle w:val="MdTableCell"/>
+            </w:pPr>
+            <w:r>
+              <w:t>A requisição POST deve retornar um status 201 Created.</w:t>
+            </w:r>
+          </w:p>
+          <w:p>
+            <w:pPr>
+              <w:pStyle w:val="MdTableCell"/>
+            </w:pPr>
+            <w:r>
+              <w:t>A resposta do POST deve conter o nome "João Silva" e um id válido.</w:t>
+            </w:r>
+          </w:p>
+          <w:p>
+            <w:pPr>
+              <w:pStyle w:val="MdTableCell"/>
+            </w:pPr>
+            <w:r>
+              <w:t>A requisição GET deve retornar um status 200 OK.</w:t>
+            </w:r>
+          </w:p>
+          <w:p>
+            <w:pPr>
+              <w:pStyle w:val="MdTableCell"/>
+            </w:pPr>
+            <w:r>
+              <w:t>A resposta do GET deve conter o nome "João Silva".</w:t>
+            </w:r>
+          </w:p>
+        </w:tc>
+        <w:tc>
+          <w:tcPr>
+            <w:tcW w:w="810" w:type="pct"/>
             <w:tcMar>
               <w:top w:w="80" w:type="dxa"/>
               <w:left w:w="120" w:type="dxa"/>
@@ -685,6 +1141,563 @@
         <w:tc>
           <w:tcPr>
             <w:tcW w:w="0" w:type="auto"/>
+            <w:tcMar>
+              <w:top w:w="80" w:type="dxa"/>
+              <w:left w:w="120" w:type="dxa"/>
+              <w:bottom w:w="80" w:type="dxa"/>
+              <w:right w:w="120" w:type="dxa"/>
+            </w:tcMar>
+            <w:vAlign w:val="center"/>
+          </w:tcPr>
+          <w:p>
+            <w:pPr>
+              <w:pStyle w:val="MdTableCell"/>
+              <w:rPr>
+                <w:rStyle w:val="MdStrong"/>
+              </w:rPr>
+            </w:pPr>
+            <w:r>
+              <w:rPr>
+                <w:rStyle w:val="MdStrong"/>
+              </w:rPr>
+              <w:t>CT0</w:t>
+            </w:r>
+            <w:r>
+              <w:rPr>
+                <w:rStyle w:val="MdStrong"/>
+              </w:rPr>
+              <w:t>7</w:t>
+            </w:r>
+          </w:p>
+          <w:p>
+            <w:pPr>
+              <w:pStyle w:val="MdTableCell"/>
+            </w:pPr>
+            <w:r>
+              <w:rPr>
+                <w:rStyle w:val="MdStrong"/>
+              </w:rPr>
+              <w:t>CT0</w:t>
+            </w:r>
+            <w:r>
+              <w:rPr>
+                <w:rStyle w:val="MdStrong"/>
+              </w:rPr>
+              <w:t>8</w:t>
+            </w:r>
+          </w:p>
+        </w:tc>
+        <w:tc>
+          <w:tcPr>
+            <w:tcW w:w="0" w:type="auto"/>
+            <w:tcMar>
+              <w:top w:w="80" w:type="dxa"/>
+              <w:left w:w="120" w:type="dxa"/>
+              <w:bottom w:w="80" w:type="dxa"/>
+              <w:right w:w="120" w:type="dxa"/>
+            </w:tcMar>
+            <w:vAlign w:val="center"/>
+          </w:tcPr>
+          <w:p>
+            <w:pPr>
+              <w:pStyle w:val="MdTableCell"/>
+            </w:pPr>
+            <w:r>
+              <w:t>Tentativa de cadastrar um cliente sem fornecer o campo nome ou com o campo nome vazio.</w:t>
+            </w:r>
+            <w:r>
+              <w:t xml:space="preserve"> </w:t>
+            </w:r>
+            <w:r>
+              <w:t>(Negativo)</w:t>
+            </w:r>
+          </w:p>
+        </w:tc>
+        <w:tc>
+          <w:tcPr>
+            <w:tcW w:w="1338" w:type="pct"/>
+            <w:tcMar>
+              <w:top w:w="80" w:type="dxa"/>
+              <w:left w:w="120" w:type="dxa"/>
+              <w:bottom w:w="80" w:type="dxa"/>
+              <w:right w:w="120" w:type="dxa"/>
+            </w:tcMar>
+            <w:vAlign w:val="center"/>
+          </w:tcPr>
+          <w:p>
+            <w:pPr>
+              <w:pStyle w:val="MdTableCell"/>
+            </w:pPr>
+            <w:r>
+              <w:t>O teste utiliza parametrização para enviar duas requisições POST para o endpoint de criação de clientes com payloads inválidos (um sem o campo nome e outro com o nome vazio).</w:t>
+            </w:r>
+          </w:p>
+        </w:tc>
+        <w:tc>
+          <w:tcPr>
+            <w:tcW w:w="1659" w:type="pct"/>
+            <w:tcMar>
+              <w:top w:w="80" w:type="dxa"/>
+              <w:left w:w="120" w:type="dxa"/>
+              <w:bottom w:w="80" w:type="dxa"/>
+              <w:right w:w="120" w:type="dxa"/>
+            </w:tcMar>
+            <w:vAlign w:val="center"/>
+          </w:tcPr>
+          <w:p>
+            <w:pPr>
+              <w:pStyle w:val="MdTableCell"/>
+            </w:pPr>
+            <w:r>
+              <w:t>Ambas as requisições POST devem retornar um status 422 Unprocessable Entity.</w:t>
+            </w:r>
+          </w:p>
+          <w:p>
+            <w:pPr>
+              <w:pStyle w:val="MdTableCell"/>
+            </w:pPr>
+            <w:r>
+              <w:t>A resposta deve conter detalhes de erro indicando que o campo nome é obrigatório.</w:t>
+            </w:r>
+          </w:p>
+        </w:tc>
+        <w:tc>
+          <w:tcPr>
+            <w:tcW w:w="810" w:type="pct"/>
+            <w:tcMar>
+              <w:top w:w="80" w:type="dxa"/>
+              <w:left w:w="120" w:type="dxa"/>
+              <w:bottom w:w="80" w:type="dxa"/>
+              <w:right w:w="120" w:type="dxa"/>
+            </w:tcMar>
+            <w:vAlign w:val="center"/>
+          </w:tcPr>
+          <w:p>
+            <w:pPr>
+              <w:pStyle w:val="MdTableCell"/>
+            </w:pPr>
+            <w:r>
+              <w:rPr>
+                <w:rStyle w:val="MdStrong"/>
+              </w:rPr>
+              <w:t>Integração</w:t>
+            </w:r>
+          </w:p>
+        </w:tc>
+      </w:tr>
+      <w:tr>
+        <w:trPr>
+          <w:cantSplit/>
+          <w:trHeight w:val="576"/>
+        </w:trPr>
+        <w:tc>
+          <w:tcPr>
+            <w:tcW w:w="0" w:type="auto"/>
+            <w:tcMar>
+              <w:top w:w="80" w:type="dxa"/>
+              <w:left w:w="120" w:type="dxa"/>
+              <w:bottom w:w="80" w:type="dxa"/>
+              <w:right w:w="120" w:type="dxa"/>
+            </w:tcMar>
+            <w:vAlign w:val="center"/>
+          </w:tcPr>
+          <w:p>
+            <w:pPr>
+              <w:pStyle w:val="MdTableCell"/>
+              <w:rPr>
+                <w:rStyle w:val="MdStrong"/>
+              </w:rPr>
+            </w:pPr>
+            <w:r>
+              <w:rPr>
+                <w:rStyle w:val="MdStrong"/>
+              </w:rPr>
+              <w:t>CT0</w:t>
+            </w:r>
+            <w:r>
+              <w:rPr>
+                <w:rStyle w:val="MdStrong"/>
+              </w:rPr>
+              <w:t>9</w:t>
+            </w:r>
+          </w:p>
+        </w:tc>
+        <w:tc>
+          <w:tcPr>
+            <w:tcW w:w="0" w:type="auto"/>
+            <w:tcMar>
+              <w:top w:w="80" w:type="dxa"/>
+              <w:left w:w="120" w:type="dxa"/>
+              <w:bottom w:w="80" w:type="dxa"/>
+              <w:right w:w="120" w:type="dxa"/>
+            </w:tcMar>
+            <w:vAlign w:val="center"/>
+          </w:tcPr>
+          <w:p>
+            <w:pPr>
+              <w:pStyle w:val="MdTableCell"/>
+            </w:pPr>
+            <w:r>
+              <w:t>Criação de um pacote de banho para um cachorro, com a geração automática de agendamentos.</w:t>
+            </w:r>
+          </w:p>
+        </w:tc>
+        <w:tc>
+          <w:tcPr>
+            <w:tcW w:w="1338" w:type="pct"/>
+            <w:tcMar>
+              <w:top w:w="80" w:type="dxa"/>
+              <w:left w:w="120" w:type="dxa"/>
+              <w:bottom w:w="80" w:type="dxa"/>
+              <w:right w:w="120" w:type="dxa"/>
+            </w:tcMar>
+            <w:vAlign w:val="center"/>
+          </w:tcPr>
+          <w:p>
+            <w:pPr>
+              <w:pStyle w:val="MdTableCell"/>
+            </w:pPr>
+            <w:r>
+              <w:t>O teste primeiro cria um cliente e um cachorro. Em seguida, envia uma requisição POST para o endpoint de criação de pacotes com os dados do pacote (incluindo tipo_plano, dia_da_semana e valor_banho_base). Por fim, verifica se o pacote foi criado e se agendamentos foram gerados para ele.</w:t>
+            </w:r>
+          </w:p>
+        </w:tc>
+        <w:tc>
+          <w:tcPr>
+            <w:tcW w:w="1659" w:type="pct"/>
+            <w:tcMar>
+              <w:top w:w="80" w:type="dxa"/>
+              <w:left w:w="120" w:type="dxa"/>
+              <w:bottom w:w="80" w:type="dxa"/>
+              <w:right w:w="120" w:type="dxa"/>
+            </w:tcMar>
+            <w:vAlign w:val="center"/>
+          </w:tcPr>
+          <w:p>
+            <w:pPr>
+              <w:pStyle w:val="MdTableCell"/>
+            </w:pPr>
+            <w:r>
+              <w:t>A requisição POST para criar o pacote deve retornar um status 201 Created.</w:t>
+            </w:r>
+          </w:p>
+          <w:p>
+            <w:pPr>
+              <w:pStyle w:val="MdTableCell"/>
+            </w:pPr>
+            <w:r>
+              <w:t>A resposta deve conter o id do pacote criado.</w:t>
+            </w:r>
+          </w:p>
+          <w:p>
+            <w:pPr>
+              <w:pStyle w:val="MdTableCell"/>
+            </w:pPr>
+            <w:r>
+              <w:t>Uma requisição GET para listar os agendamentos do pacote deve retornar um status 200 OK e uma lista de agendamentos com mais de um item.</w:t>
+            </w:r>
+          </w:p>
+        </w:tc>
+        <w:tc>
+          <w:tcPr>
+            <w:tcW w:w="810" w:type="pct"/>
+            <w:tcMar>
+              <w:top w:w="80" w:type="dxa"/>
+              <w:left w:w="120" w:type="dxa"/>
+              <w:bottom w:w="80" w:type="dxa"/>
+              <w:right w:w="120" w:type="dxa"/>
+            </w:tcMar>
+            <w:vAlign w:val="center"/>
+          </w:tcPr>
+          <w:p>
+            <w:pPr>
+              <w:pStyle w:val="MdTableCell"/>
+              <w:rPr>
+                <w:rStyle w:val="MdStrong"/>
+              </w:rPr>
+            </w:pPr>
+            <w:r>
+              <w:rPr>
+                <w:rStyle w:val="MdStrong"/>
+              </w:rPr>
+              <w:t>Integração</w:t>
+            </w:r>
+          </w:p>
+        </w:tc>
+      </w:tr>
+      <w:tr>
+        <w:trPr>
+          <w:cantSplit/>
+          <w:trHeight w:val="576"/>
+        </w:trPr>
+        <w:tc>
+          <w:tcPr>
+            <w:tcW w:w="0" w:type="auto"/>
+            <w:tcMar>
+              <w:top w:w="80" w:type="dxa"/>
+              <w:left w:w="120" w:type="dxa"/>
+              <w:bottom w:w="80" w:type="dxa"/>
+              <w:right w:w="120" w:type="dxa"/>
+            </w:tcMar>
+            <w:vAlign w:val="center"/>
+          </w:tcPr>
+          <w:p>
+            <w:pPr>
+              <w:pStyle w:val="MdTableCell"/>
+              <w:rPr>
+                <w:rStyle w:val="MdStrong"/>
+              </w:rPr>
+            </w:pPr>
+            <w:r>
+              <w:rPr>
+                <w:rStyle w:val="MdStrong"/>
+              </w:rPr>
+              <w:lastRenderedPageBreak/>
+              <w:t>CT</w:t>
+            </w:r>
+            <w:r>
+              <w:rPr>
+                <w:rStyle w:val="MdStrong"/>
+              </w:rPr>
+              <w:t>10</w:t>
+            </w:r>
+          </w:p>
+        </w:tc>
+        <w:tc>
+          <w:tcPr>
+            <w:tcW w:w="0" w:type="auto"/>
+            <w:tcMar>
+              <w:top w:w="80" w:type="dxa"/>
+              <w:left w:w="120" w:type="dxa"/>
+              <w:bottom w:w="80" w:type="dxa"/>
+              <w:right w:w="120" w:type="dxa"/>
+            </w:tcMar>
+            <w:vAlign w:val="center"/>
+          </w:tcPr>
+          <w:p>
+            <w:pPr>
+              <w:pStyle w:val="MdTableCell"/>
+            </w:pPr>
+            <w:r>
+              <w:t>Registro de pagamento para um pacote existente.</w:t>
+            </w:r>
+          </w:p>
+        </w:tc>
+        <w:tc>
+          <w:tcPr>
+            <w:tcW w:w="1338" w:type="pct"/>
+            <w:tcMar>
+              <w:top w:w="80" w:type="dxa"/>
+              <w:left w:w="120" w:type="dxa"/>
+              <w:bottom w:w="80" w:type="dxa"/>
+              <w:right w:w="120" w:type="dxa"/>
+            </w:tcMar>
+            <w:vAlign w:val="center"/>
+          </w:tcPr>
+          <w:p>
+            <w:pPr>
+              <w:pStyle w:val="MdTableCell"/>
+            </w:pPr>
+            <w:r>
+              <w:t>O teste cria um cliente, um cachorro e um pacote. Em seguida, envia uma requisição PATCH para o endpoint de registro de pagamento com o valor_pago e data_pagamento. Por fim, verifica se o status de pagamento do pacote foi atualizado para "pago".</w:t>
+            </w:r>
+          </w:p>
+        </w:tc>
+        <w:tc>
+          <w:tcPr>
+            <w:tcW w:w="1659" w:type="pct"/>
+            <w:tcMar>
+              <w:top w:w="80" w:type="dxa"/>
+              <w:left w:w="120" w:type="dxa"/>
+              <w:bottom w:w="80" w:type="dxa"/>
+              <w:right w:w="120" w:type="dxa"/>
+            </w:tcMar>
+            <w:vAlign w:val="center"/>
+          </w:tcPr>
+          <w:p>
+            <w:pPr>
+              <w:pStyle w:val="MdTableCell"/>
+            </w:pPr>
+            <w:r>
+              <w:t>A requisição PATCH deve retornar um status 200 OK.</w:t>
+            </w:r>
+          </w:p>
+          <w:p>
+            <w:pPr>
+              <w:pStyle w:val="MdTableCell"/>
+            </w:pPr>
+            <w:r>
+              <w:t>Uma requisição GET para obter os detalhes do pacote deve retornar um status 200 OK e o campo status_pagamento deve ser "pago".</w:t>
+            </w:r>
+          </w:p>
+        </w:tc>
+        <w:tc>
+          <w:tcPr>
+            <w:tcW w:w="810" w:type="pct"/>
+            <w:tcMar>
+              <w:top w:w="80" w:type="dxa"/>
+              <w:left w:w="120" w:type="dxa"/>
+              <w:bottom w:w="80" w:type="dxa"/>
+              <w:right w:w="120" w:type="dxa"/>
+            </w:tcMar>
+            <w:vAlign w:val="center"/>
+          </w:tcPr>
+          <w:p>
+            <w:pPr>
+              <w:pStyle w:val="MdTableCell"/>
+              <w:rPr>
+                <w:rStyle w:val="MdStrong"/>
+              </w:rPr>
+            </w:pPr>
+            <w:r>
+              <w:rPr>
+                <w:rStyle w:val="MdStrong"/>
+              </w:rPr>
+              <w:t>Integração</w:t>
+            </w:r>
+          </w:p>
+        </w:tc>
+      </w:tr>
+      <w:tr>
+        <w:trPr>
+          <w:cantSplit/>
+          <w:trHeight w:val="576"/>
+        </w:trPr>
+        <w:tc>
+          <w:tcPr>
+            <w:tcW w:w="0" w:type="auto"/>
+            <w:tcMar>
+              <w:top w:w="80" w:type="dxa"/>
+              <w:left w:w="120" w:type="dxa"/>
+              <w:bottom w:w="80" w:type="dxa"/>
+              <w:right w:w="120" w:type="dxa"/>
+            </w:tcMar>
+            <w:vAlign w:val="center"/>
+          </w:tcPr>
+          <w:p>
+            <w:pPr>
+              <w:pStyle w:val="MdTableCell"/>
+              <w:rPr>
+                <w:rStyle w:val="MdStrong"/>
+              </w:rPr>
+            </w:pPr>
+            <w:r>
+              <w:rPr>
+                <w:rStyle w:val="MdStrong"/>
+              </w:rPr>
+              <w:t>CT</w:t>
+            </w:r>
+            <w:r>
+              <w:rPr>
+                <w:rStyle w:val="MdStrong"/>
+              </w:rPr>
+              <w:t>11</w:t>
+            </w:r>
+          </w:p>
+        </w:tc>
+        <w:tc>
+          <w:tcPr>
+            <w:tcW w:w="0" w:type="auto"/>
+            <w:tcMar>
+              <w:top w:w="80" w:type="dxa"/>
+              <w:left w:w="120" w:type="dxa"/>
+              <w:bottom w:w="80" w:type="dxa"/>
+              <w:right w:w="120" w:type="dxa"/>
+            </w:tcMar>
+            <w:vAlign w:val="center"/>
+          </w:tcPr>
+          <w:p>
+            <w:pPr>
+              <w:pStyle w:val="MdTableCell"/>
+            </w:pPr>
+            <w:r>
+              <w:t>Verificação da exibição de agendamentos no dashboard para uma data específica.</w:t>
+            </w:r>
+          </w:p>
+        </w:tc>
+        <w:tc>
+          <w:tcPr>
+            <w:tcW w:w="1338" w:type="pct"/>
+            <w:tcMar>
+              <w:top w:w="80" w:type="dxa"/>
+              <w:left w:w="120" w:type="dxa"/>
+              <w:bottom w:w="80" w:type="dxa"/>
+              <w:right w:w="120" w:type="dxa"/>
+            </w:tcMar>
+            <w:vAlign w:val="center"/>
+          </w:tcPr>
+          <w:p>
+            <w:pPr>
+              <w:pStyle w:val="MdTableCell"/>
+            </w:pPr>
+            <w:r>
+              <w:t>O teste cria um cliente, um cachorro e um pacote. Ele então recupera a data de um dos agendamentos gerados automaticamente para esse pacote. Em seguida, envia uma requisição GET para o endpoint do dashboard usando a data recuperada e verifica se o cachorro ("Mel") aparece na lista de agendamentos do dashboard.</w:t>
+            </w:r>
+          </w:p>
+        </w:tc>
+        <w:tc>
+          <w:tcPr>
+            <w:tcW w:w="1659" w:type="pct"/>
+            <w:tcMar>
+              <w:top w:w="80" w:type="dxa"/>
+              <w:left w:w="120" w:type="dxa"/>
+              <w:bottom w:w="80" w:type="dxa"/>
+              <w:right w:w="120" w:type="dxa"/>
+            </w:tcMar>
+            <w:vAlign w:val="center"/>
+          </w:tcPr>
+          <w:p>
+            <w:pPr>
+              <w:pStyle w:val="MdTableCell"/>
+            </w:pPr>
+            <w:r>
+              <w:t>A requisição GET para o dashboard deve retornar um status 200 OK.</w:t>
+            </w:r>
+          </w:p>
+          <w:p>
+            <w:pPr>
+              <w:pStyle w:val="MdTableCell"/>
+            </w:pPr>
+            <w:r>
+              <w:t>A resposta do dashboard deve conter um item onde pet_nome é "Mel".</w:t>
+            </w:r>
+          </w:p>
+        </w:tc>
+        <w:tc>
+          <w:tcPr>
+            <w:tcW w:w="810" w:type="pct"/>
+            <w:tcMar>
+              <w:top w:w="80" w:type="dxa"/>
+              <w:left w:w="120" w:type="dxa"/>
+              <w:bottom w:w="80" w:type="dxa"/>
+              <w:right w:w="120" w:type="dxa"/>
+            </w:tcMar>
+            <w:vAlign w:val="center"/>
+          </w:tcPr>
+          <w:p>
+            <w:pPr>
+              <w:pStyle w:val="MdTableCell"/>
+              <w:rPr>
+                <w:rStyle w:val="MdStrong"/>
+              </w:rPr>
+            </w:pPr>
+            <w:r>
+              <w:rPr>
+                <w:rStyle w:val="MdStrong"/>
+              </w:rPr>
+              <w:t>Integração</w:t>
+            </w:r>
+          </w:p>
+        </w:tc>
+      </w:tr>
+      <w:tr>
+        <w:trPr>
+          <w:cantSplit/>
+          <w:trHeight w:val="576"/>
+        </w:trPr>
+        <w:tc>
+          <w:tcPr>
+            <w:tcW w:w="0" w:type="auto"/>
             <w:tcBorders>
               <w:bottom w:val="single" w:sz="4" w:space="0" w:color="E1E4E8"/>
             </w:tcBorders>
@@ -699,12 +1712,21 @@
           <w:p>
             <w:pPr>
               <w:pStyle w:val="MdTableCell"/>
-            </w:pPr>
-            <w:r>
-              <w:rPr>
-                <w:rStyle w:val="MdStrong"/>
-              </w:rPr>
-              <w:t>CT04</w:t>
+              <w:rPr>
+                <w:rStyle w:val="MdStrong"/>
+              </w:rPr>
+            </w:pPr>
+            <w:r>
+              <w:rPr>
+                <w:rStyle w:val="MdStrong"/>
+              </w:rPr>
+              <w:t>CT</w:t>
+            </w:r>
+            <w:r>
+              <w:rPr>
+                <w:rStyle w:val="MdStrong"/>
+              </w:rPr>
+              <w:t>12</w:t>
             </w:r>
           </w:p>
         </w:tc>
@@ -727,13 +1749,13 @@
               <w:pStyle w:val="MdTableCell"/>
             </w:pPr>
             <w:r>
-              <w:t>Registro de Pagamento de Pacote (Positivo)</w:t>
-            </w:r>
-          </w:p>
-        </w:tc>
-        <w:tc>
-          <w:tcPr>
-            <w:tcW w:w="0" w:type="auto"/>
+              <w:t>Edição do status de presença de um agendamento.</w:t>
+            </w:r>
+          </w:p>
+        </w:tc>
+        <w:tc>
+          <w:tcPr>
+            <w:tcW w:w="1338" w:type="pct"/>
             <w:tcBorders>
               <w:bottom w:val="single" w:sz="4" w:space="0" w:color="E1E4E8"/>
             </w:tcBorders>
@@ -750,21 +1772,13 @@
               <w:pStyle w:val="MdTableCell"/>
             </w:pPr>
             <w:r>
-              <w:t xml:space="preserve">Marcar um pacote existente como "Pago" através do </w:t>
-            </w:r>
-            <w:proofErr w:type="spellStart"/>
-            <w:r>
-              <w:t>endpoint</w:t>
-            </w:r>
-            <w:proofErr w:type="spellEnd"/>
-            <w:r>
-              <w:t xml:space="preserve"> de pagamento.</w:t>
-            </w:r>
-          </w:p>
-        </w:tc>
-        <w:tc>
-          <w:tcPr>
-            <w:tcW w:w="0" w:type="auto"/>
+              <w:t>O teste cria um cliente, um cachorro e um pacote. Ele recupera o id de um agendamento gerado para esse pacote. Em seguida, envia uma requisição PUT para o endpoint de atualização de agendamento para mudar o status_presenca para "concluido".</w:t>
+            </w:r>
+          </w:p>
+        </w:tc>
+        <w:tc>
+          <w:tcPr>
+            <w:tcW w:w="1659" w:type="pct"/>
             <w:tcBorders>
               <w:bottom w:val="single" w:sz="4" w:space="0" w:color="E1E4E8"/>
             </w:tcBorders>
@@ -781,13 +1795,21 @@
               <w:pStyle w:val="MdTableCell"/>
             </w:pPr>
             <w:r>
-              <w:t>O status do pacote deve mudar para "pago" e a data do pagamento deve ser registrada corretamente no histórico financeiro.</w:t>
-            </w:r>
-          </w:p>
-        </w:tc>
-        <w:tc>
-          <w:tcPr>
-            <w:tcW w:w="0" w:type="auto"/>
+              <w:t>A requisição PUT deve retornar um status 200 OK.</w:t>
+            </w:r>
+          </w:p>
+          <w:p>
+            <w:pPr>
+              <w:pStyle w:val="MdTableCell"/>
+            </w:pPr>
+            <w:r>
+              <w:t>A resposta do PUT deve conter o status_presenca como "concluido".</w:t>
+            </w:r>
+          </w:p>
+        </w:tc>
+        <w:tc>
+          <w:tcPr>
+            <w:tcW w:w="810" w:type="pct"/>
             <w:tcBorders>
               <w:bottom w:val="single" w:sz="4" w:space="0" w:color="E1E4E8"/>
             </w:tcBorders>
@@ -802,6 +1824,9 @@
           <w:p>
             <w:pPr>
               <w:pStyle w:val="MdTableCell"/>
+              <w:rPr>
+                <w:rStyle w:val="MdStrong"/>
+              </w:rPr>
             </w:pPr>
             <w:r>
               <w:rPr>
@@ -818,7 +1843,59 @@
         <w:pStyle w:val="MdHeading3"/>
       </w:pPr>
       <w:r>
-        <w:t>3. Agenda Dinâmica</w:t>
+        <w:lastRenderedPageBreak/>
+        <w:drawing>
+          <wp:inline distT="0" distB="0" distL="0" distR="0" wp14:anchorId="68E4DD59" wp14:editId="4432DC6A">
+            <wp:extent cx="5731510" cy="1818640"/>
+            <wp:effectExtent l="0" t="0" r="2540" b="0"/>
+            <wp:docPr id="1247754765" name="Imagem 1"/>
+            <wp:cNvGraphicFramePr>
+              <a:graphicFrameLocks xmlns:a="http://schemas.openxmlformats.org/drawingml/2006/main" noChangeAspect="1"/>
+            </wp:cNvGraphicFramePr>
+            <a:graphic xmlns:a="http://schemas.openxmlformats.org/drawingml/2006/main">
+              <a:graphicData uri="http://schemas.openxmlformats.org/drawingml/2006/picture">
+                <pic:pic xmlns:pic="http://schemas.openxmlformats.org/drawingml/2006/picture">
+                  <pic:nvPicPr>
+                    <pic:cNvPr id="1247754765" name=""/>
+                    <pic:cNvPicPr/>
+                  </pic:nvPicPr>
+                  <pic:blipFill>
+                    <a:blip r:embed="rId6"/>
+                    <a:stretch>
+                      <a:fillRect/>
+                    </a:stretch>
+                  </pic:blipFill>
+                  <pic:spPr>
+                    <a:xfrm>
+                      <a:off x="0" y="0"/>
+                      <a:ext cx="5731510" cy="1818640"/>
+                    </a:xfrm>
+                    <a:prstGeom prst="rect">
+                      <a:avLst/>
+                    </a:prstGeom>
+                  </pic:spPr>
+                </pic:pic>
+              </a:graphicData>
+            </a:graphic>
+          </wp:inline>
+        </w:drawing>
+      </w:r>
+    </w:p>
+    <w:p>
+      <w:pPr>
+        <w:pStyle w:val="MdHeading3"/>
+        <w:rPr>
+          <w:u w:val="single"/>
+        </w:rPr>
+      </w:pPr>
+      <w:r>
+        <w:t xml:space="preserve">3. </w:t>
+      </w:r>
+      <w:r>
+        <w:t>Teste E2E</w:t>
+      </w:r>
+      <w:r>
+        <w:t xml:space="preserve"> (Não aplicado)</w:t>
       </w:r>
     </w:p>
     <w:tbl>
@@ -838,10 +1915,10 @@
       </w:tblPr>
       <w:tblGrid>
         <w:gridCol w:w="718"/>
-        <w:gridCol w:w="1788"/>
-        <w:gridCol w:w="2194"/>
-        <w:gridCol w:w="2769"/>
-        <w:gridCol w:w="1557"/>
+        <w:gridCol w:w="1505"/>
+        <w:gridCol w:w="2940"/>
+        <w:gridCol w:w="2372"/>
+        <w:gridCol w:w="1491"/>
       </w:tblGrid>
       <w:tr>
         <w:trPr>
@@ -974,68 +2051,220 @@
               <w:rPr>
                 <w:rStyle w:val="MdStrong"/>
               </w:rPr>
-              <w:t>CT05</w:t>
-            </w:r>
-          </w:p>
-        </w:tc>
-        <w:tc>
-          <w:tcPr>
-            <w:tcW w:w="0" w:type="auto"/>
-            <w:tcMar>
-              <w:top w:w="80" w:type="dxa"/>
-              <w:left w:w="120" w:type="dxa"/>
-              <w:bottom w:w="80" w:type="dxa"/>
-              <w:right w:w="120" w:type="dxa"/>
-            </w:tcMar>
-            <w:vAlign w:val="center"/>
-          </w:tcPr>
-          <w:p>
-            <w:pPr>
-              <w:pStyle w:val="MdTableCell"/>
-            </w:pPr>
-            <w:r>
-              <w:t>Visualização de Banhos no Calendário (Positivo)</w:t>
-            </w:r>
-          </w:p>
-        </w:tc>
-        <w:tc>
-          <w:tcPr>
-            <w:tcW w:w="0" w:type="auto"/>
-            <w:tcMar>
-              <w:top w:w="80" w:type="dxa"/>
-              <w:left w:w="120" w:type="dxa"/>
-              <w:bottom w:w="80" w:type="dxa"/>
-              <w:right w:w="120" w:type="dxa"/>
-            </w:tcMar>
-            <w:vAlign w:val="center"/>
-          </w:tcPr>
-          <w:p>
-            <w:pPr>
-              <w:pStyle w:val="MdTableCell"/>
-            </w:pPr>
-            <w:r>
-              <w:t>Acessar a Dashboard e selecionar uma data que possua banhos agendados.</w:t>
-            </w:r>
-          </w:p>
-        </w:tc>
-        <w:tc>
-          <w:tcPr>
-            <w:tcW w:w="0" w:type="auto"/>
-            <w:tcMar>
-              <w:top w:w="80" w:type="dxa"/>
-              <w:left w:w="120" w:type="dxa"/>
-              <w:bottom w:w="80" w:type="dxa"/>
-              <w:right w:w="120" w:type="dxa"/>
-            </w:tcMar>
-            <w:vAlign w:val="center"/>
-          </w:tcPr>
-          <w:p>
-            <w:pPr>
-              <w:pStyle w:val="MdTableCell"/>
-            </w:pPr>
-            <w:r>
-              <w:t>A interface deve destacar visualmente o dia e listar todos os pets e clientes vinculados aos banhos daquela data específica.</w:t>
-            </w:r>
+              <w:t>CT</w:t>
+            </w:r>
+            <w:r>
+              <w:rPr>
+                <w:rStyle w:val="MdStrong"/>
+              </w:rPr>
+              <w:t>13</w:t>
+            </w:r>
+          </w:p>
+        </w:tc>
+        <w:tc>
+          <w:tcPr>
+            <w:tcW w:w="0" w:type="auto"/>
+            <w:tcMar>
+              <w:top w:w="80" w:type="dxa"/>
+              <w:left w:w="120" w:type="dxa"/>
+              <w:bottom w:w="80" w:type="dxa"/>
+              <w:right w:w="120" w:type="dxa"/>
+            </w:tcMar>
+            <w:vAlign w:val="center"/>
+          </w:tcPr>
+          <w:p>
+            <w:pPr>
+              <w:pStyle w:val="MdTableCell"/>
+            </w:pPr>
+            <w:r>
+              <w:t> Jornada completa de integração de um novo cliente no sistema.</w:t>
+            </w:r>
+          </w:p>
+        </w:tc>
+        <w:tc>
+          <w:tcPr>
+            <w:tcW w:w="0" w:type="auto"/>
+            <w:tcMar>
+              <w:top w:w="80" w:type="dxa"/>
+              <w:left w:w="120" w:type="dxa"/>
+              <w:bottom w:w="80" w:type="dxa"/>
+              <w:right w:w="120" w:type="dxa"/>
+            </w:tcMar>
+            <w:vAlign w:val="center"/>
+          </w:tcPr>
+          <w:p>
+            <w:pPr>
+              <w:pStyle w:val="MdTableCell"/>
+            </w:pPr>
+            <w:r>
+              <w:t>Este teste simula</w:t>
+            </w:r>
+            <w:r>
+              <w:t xml:space="preserve">, um ambiente </w:t>
+            </w:r>
+            <w:r>
+              <w:t>onde um atendente abre o sistema e realiza o fluxo principal:</w:t>
+            </w:r>
+          </w:p>
+          <w:p>
+            <w:pPr>
+              <w:pStyle w:val="MdTableCell"/>
+              <w:numPr>
+                <w:ilvl w:val="0"/>
+                <w:numId w:val="4"/>
+              </w:numPr>
+            </w:pPr>
+            <w:r>
+              <w:t>Acessa a página inicial.</w:t>
+            </w:r>
+          </w:p>
+          <w:p>
+            <w:pPr>
+              <w:pStyle w:val="MdTableCell"/>
+              <w:numPr>
+                <w:ilvl w:val="0"/>
+                <w:numId w:val="4"/>
+              </w:numPr>
+            </w:pPr>
+            <w:r>
+              <w:t>Navega até a tela de </w:t>
+            </w:r>
+            <w:r>
+              <w:rPr>
+                <w:b/>
+                <w:bCs/>
+              </w:rPr>
+              <w:t>Clientes</w:t>
+            </w:r>
+            <w:r>
+              <w:t>.</w:t>
+            </w:r>
+          </w:p>
+          <w:p>
+            <w:pPr>
+              <w:pStyle w:val="MdTableCell"/>
+              <w:numPr>
+                <w:ilvl w:val="0"/>
+                <w:numId w:val="4"/>
+              </w:numPr>
+            </w:pPr>
+            <w:r>
+              <w:t>Cria um novo cliente chamado "Augusto Playwright".</w:t>
+            </w:r>
+          </w:p>
+          <w:p>
+            <w:pPr>
+              <w:pStyle w:val="MdTableCell"/>
+              <w:numPr>
+                <w:ilvl w:val="0"/>
+                <w:numId w:val="4"/>
+              </w:numPr>
+            </w:pPr>
+            <w:r>
+              <w:t>Dentro do card desse novo cliente, clica para adicionar um </w:t>
+            </w:r>
+            <w:r>
+              <w:rPr>
+                <w:b/>
+                <w:bCs/>
+              </w:rPr>
+              <w:t>Pet</w:t>
+            </w:r>
+            <w:r>
+              <w:t> chamado "Spyke E2E".</w:t>
+            </w:r>
+          </w:p>
+          <w:p>
+            <w:pPr>
+              <w:pStyle w:val="MdTableCell"/>
+              <w:numPr>
+                <w:ilvl w:val="0"/>
+                <w:numId w:val="4"/>
+              </w:numPr>
+            </w:pPr>
+            <w:r>
+              <w:t>A partir do pet, inicia a criação de um </w:t>
+            </w:r>
+            <w:r>
+              <w:rPr>
+                <w:b/>
+                <w:bCs/>
+              </w:rPr>
+              <w:t>Pacote Semanal</w:t>
+            </w:r>
+            <w:r>
+              <w:t> para as sextas-feiras com valor base de R$ 60,00.</w:t>
+            </w:r>
+          </w:p>
+          <w:p>
+            <w:pPr>
+              <w:pStyle w:val="MdTableCell"/>
+              <w:numPr>
+                <w:ilvl w:val="0"/>
+                <w:numId w:val="4"/>
+              </w:numPr>
+            </w:pPr>
+            <w:r>
+              <w:t>Finaliza voltando ao Dashboard para verificar se os dados foram processados.</w:t>
+            </w:r>
+          </w:p>
+          <w:p>
+            <w:pPr>
+              <w:pStyle w:val="MdTableCell"/>
+            </w:pPr>
+          </w:p>
+        </w:tc>
+        <w:tc>
+          <w:tcPr>
+            <w:tcW w:w="0" w:type="auto"/>
+            <w:tcMar>
+              <w:top w:w="80" w:type="dxa"/>
+              <w:left w:w="120" w:type="dxa"/>
+              <w:bottom w:w="80" w:type="dxa"/>
+              <w:right w:w="120" w:type="dxa"/>
+            </w:tcMar>
+            <w:vAlign w:val="center"/>
+          </w:tcPr>
+          <w:p>
+            <w:pPr>
+              <w:pStyle w:val="MdTableCell"/>
+              <w:numPr>
+                <w:ilvl w:val="0"/>
+                <w:numId w:val="5"/>
+              </w:numPr>
+            </w:pPr>
+            <w:r>
+              <w:t>O cliente e o pet devem aparecer na listagem após a criação.</w:t>
+            </w:r>
+          </w:p>
+          <w:p>
+            <w:pPr>
+              <w:pStyle w:val="MdTableCell"/>
+              <w:numPr>
+                <w:ilvl w:val="0"/>
+                <w:numId w:val="5"/>
+              </w:numPr>
+            </w:pPr>
+            <w:r>
+              <w:t>O modal de pacote deve fechar sem erros.</w:t>
+            </w:r>
+          </w:p>
+          <w:p>
+            <w:pPr>
+              <w:pStyle w:val="MdTableCell"/>
+              <w:numPr>
+                <w:ilvl w:val="0"/>
+                <w:numId w:val="5"/>
+              </w:numPr>
+            </w:pPr>
+            <w:r>
+              <w:t>O Dashboard deve estar acessível e exibir o contador de "Pacotes Ativos" atualizado.</w:t>
+            </w:r>
+          </w:p>
+          <w:p>
+            <w:pPr>
+              <w:pStyle w:val="MdTableCell"/>
+            </w:pPr>
           </w:p>
         </w:tc>
         <w:tc>
@@ -1090,7 +2319,13 @@
                 <w:rStyle w:val="MdStrong"/>
               </w:rPr>
               <w:lastRenderedPageBreak/>
-              <w:t>CT06</w:t>
+              <w:t>CT</w:t>
+            </w:r>
+            <w:r>
+              <w:rPr>
+                <w:rStyle w:val="MdStrong"/>
+              </w:rPr>
+              <w:t>14</w:t>
             </w:r>
           </w:p>
         </w:tc>
@@ -1113,7 +2348,7 @@
               <w:pStyle w:val="MdTableCell"/>
             </w:pPr>
             <w:r>
-              <w:t>Edição de Status de Presença (Positivo)</w:t>
+              <w:t> Verificação de integridade da página inicial (Dashboard).</w:t>
             </w:r>
           </w:p>
         </w:tc>
@@ -1136,16 +2371,57 @@
               <w:pStyle w:val="MdTableCell"/>
             </w:pPr>
             <w:r>
-              <w:t>Na agenda do dia, alterar o status de um banho de "pendente" para "</w:t>
-            </w:r>
-            <w:proofErr w:type="spellStart"/>
-            <w:r>
-              <w:t>concluido</w:t>
-            </w:r>
-            <w:proofErr w:type="spellEnd"/>
-            <w:r>
-              <w:t>".</w:t>
-            </w:r>
+              <w:t>Um teste mais rápido (</w:t>
+            </w:r>
+            <w:r>
+              <w:rPr>
+                <w:i/>
+                <w:iCs/>
+              </w:rPr>
+              <w:t>Smoke Test</w:t>
+            </w:r>
+            <w:r>
+              <w:t>) que apenas entra na URL base e verifica se os componentes essenciais carregaram:</w:t>
+            </w:r>
+          </w:p>
+          <w:p>
+            <w:pPr>
+              <w:pStyle w:val="MdTableCell"/>
+              <w:numPr>
+                <w:ilvl w:val="0"/>
+                <w:numId w:val="6"/>
+              </w:numPr>
+            </w:pPr>
+            <w:r>
+              <w:t>Verifica a presença dos cards de estatísticas ("Receita Prevista" e "Cachorros").</w:t>
+            </w:r>
+          </w:p>
+          <w:p>
+            <w:pPr>
+              <w:pStyle w:val="MdTableCell"/>
+              <w:numPr>
+                <w:ilvl w:val="0"/>
+                <w:numId w:val="6"/>
+              </w:numPr>
+            </w:pPr>
+            <w:r>
+              <w:t>Verifica se o componente de </w:t>
+            </w:r>
+            <w:r>
+              <w:rPr>
+                <w:b/>
+                <w:bCs/>
+              </w:rPr>
+              <w:t>Calendário</w:t>
+            </w:r>
+            <w:r>
+              <w:t> (que é o coração da agenda) foi renderizado na tela.</w:t>
+            </w:r>
+          </w:p>
+          <w:p>
+            <w:pPr>
+              <w:pStyle w:val="MdTableCell"/>
+            </w:pPr>
           </w:p>
         </w:tc>
         <w:tc>
@@ -1167,8 +2443,13 @@
               <w:pStyle w:val="MdTableCell"/>
             </w:pPr>
             <w:r>
-              <w:t>O status deve ser atualizado na interface e persistido no banco de dados, refletindo a presença do animal.</w:t>
-            </w:r>
+              <w:t>Os elementos visuais críticos devem estar presentes e visíveis no navegador, garantindo que o Frontend conseguiu buscar os dados iniciais da API.</w:t>
+            </w:r>
+          </w:p>
+          <w:p>
+            <w:pPr>
+              <w:pStyle w:val="MdTableCell"/>
+            </w:pPr>
           </w:p>
         </w:tc>
         <w:tc>
@@ -1212,117 +2493,6 @@
         <w:pStyle w:val="MdSpace"/>
         <w:spacing w:after="60"/>
       </w:pPr>
-    </w:p>
-    <w:p>
-      <w:pPr>
-        <w:pStyle w:val="MdHeading2"/>
-      </w:pPr>
-      <w:r>
-        <w:t>Classificação dos Testes</w:t>
-      </w:r>
-    </w:p>
-    <w:p>
-      <w:pPr>
-        <w:pStyle w:val="MdParagraph"/>
-      </w:pPr>
-      <w:r>
-        <w:t xml:space="preserve">Para garantir a qualidade do software </w:t>
-      </w:r>
-      <w:proofErr w:type="spellStart"/>
-      <w:r>
-        <w:rPr>
-          <w:rStyle w:val="MdStrong"/>
-        </w:rPr>
-        <w:t>PacotesBanho</w:t>
-      </w:r>
-      <w:proofErr w:type="spellEnd"/>
-      <w:r>
-        <w:t>, os testes foram classificados da seguinte forma:</w:t>
-      </w:r>
-    </w:p>
-    <w:p>
-      <w:pPr>
-        <w:pStyle w:val="MdSpace"/>
-        <w:spacing w:after="60"/>
-      </w:pPr>
-    </w:p>
-    <w:p>
-      <w:pPr>
-        <w:pStyle w:val="MdListItem"/>
-        <w:numPr>
-          <w:ilvl w:val="0"/>
-          <w:numId w:val="3"/>
-        </w:numPr>
-      </w:pPr>
-      <w:r>
-        <w:rPr>
-          <w:rStyle w:val="MdStrong"/>
-        </w:rPr>
-        <w:t>Testes Unitários (CT01, CT02):</w:t>
-      </w:r>
-      <w:r>
-        <w:t xml:space="preserve"> Focam na validação isolada das regras de negócio e esquemas de dados (</w:t>
-      </w:r>
-      <w:proofErr w:type="spellStart"/>
-      <w:r>
-        <w:t>Pydantic</w:t>
-      </w:r>
-      <w:proofErr w:type="spellEnd"/>
-      <w:r>
-        <w:t>), garantindo que as entidades básicas sejam criadas corretamente conforme as restrições de obrigatoriedade.</w:t>
-      </w:r>
-    </w:p>
-    <w:p>
-      <w:pPr>
-        <w:pStyle w:val="MdListItem"/>
-        <w:numPr>
-          <w:ilvl w:val="0"/>
-          <w:numId w:val="3"/>
-        </w:numPr>
-      </w:pPr>
-      <w:r>
-        <w:rPr>
-          <w:rStyle w:val="MdStrong"/>
-        </w:rPr>
-        <w:t>Testes de Integração (CT03, CT04):</w:t>
-      </w:r>
-      <w:r>
-        <w:t xml:space="preserve"> Validam a comunicação entre diferentes partes do sistema, como a criação de um registro disparando a geração automática de outros (Pacotes -&gt; Agendamentos) e a persistência de estados financeiros no banco de dados.</w:t>
-      </w:r>
-    </w:p>
-    <w:p>
-      <w:pPr>
-        <w:pStyle w:val="MdListItem"/>
-        <w:numPr>
-          <w:ilvl w:val="0"/>
-          <w:numId w:val="3"/>
-        </w:numPr>
-      </w:pPr>
-      <w:r>
-        <w:rPr>
-          <w:rStyle w:val="MdStrong"/>
-        </w:rPr>
-        <w:t>Testes E2E - Ponta a Ponta (CT05, CT06):</w:t>
-      </w:r>
-      <w:r>
-        <w:t xml:space="preserve"> Simulam a jornada real do usuário na interface gráfica (</w:t>
-      </w:r>
-      <w:proofErr w:type="spellStart"/>
-      <w:r>
-        <w:t>Frontend</w:t>
-      </w:r>
-      <w:proofErr w:type="spellEnd"/>
-      <w:r>
-        <w:t>) interagindo com o servidor (</w:t>
-      </w:r>
-      <w:proofErr w:type="spellStart"/>
-      <w:r>
-        <w:t>Backend</w:t>
-      </w:r>
-      <w:proofErr w:type="spellEnd"/>
-      <w:r>
-        <w:t>), garantindo que a visualização da agenda e a atualização de status funcionem de forma fluida e integrada.</w:t>
-      </w:r>
     </w:p>
     <w:p>
       <w:pPr>
@@ -1343,6 +2513,304 @@
 <file path=word/numbering.xml><?xml version="1.0" encoding="utf-8"?>
 <w:numbering xmlns:wpc="http://schemas.microsoft.com/office/word/2010/wordprocessingCanvas" xmlns:cx="http://schemas.microsoft.com/office/drawing/2014/chartex" xmlns:cx1="http://schemas.microsoft.com/office/drawing/2015/9/8/chartex" xmlns:cx2="http://schemas.microsoft.com/office/drawing/2015/10/21/chartex" xmlns:cx3="http://schemas.microsoft.com/office/drawing/2016/5/9/chartex" xmlns:cx4="http://schemas.microsoft.com/office/drawing/2016/5/10/chartex" xmlns:cx5="http://schemas.microsoft.com/office/drawing/2016/5/11/chartex" xmlns:cx6="http://schemas.microsoft.com/office/drawing/2016/5/12/chartex" xmlns:cx7="http://schemas.microsoft.com/office/drawing/2016/5/13/chartex" xmlns:cx8="http://schemas.microsoft.com/office/drawing/2016/5/14/chartex" xmlns:mc="http://schemas.openxmlformats.org/markup-compatibility/2006" xmlns:aink="http://schemas.microsoft.com/office/drawing/2016/ink" xmlns:am3d="http://schemas.microsoft.com/office/drawing/2017/model3d" xmlns:o="urn:schemas-microsoft-com:office:office" xmlns:oel="http://schemas.microsoft.com/office/2019/extlst" xmlns:r="http://schemas.openxmlformats.org/officeDocument/2006/relationships" xmlns:m="http://schemas.openxmlformats.org/officeDocument/2006/math" xmlns:v="urn:schemas-microsoft-com:vml" xmlns:wp14="http://schemas.microsoft.com/office/word/2010/wordprocessingDrawing" xmlns:wp="http://schemas.openxmlformats.org/drawingml/2006/wordprocessingDrawing" xmlns:w10="urn:schemas-microsoft-com:office:word" xmlns:w="http://schemas.openxmlformats.org/wordprocessingml/2006/main" xmlns:w14="http://schemas.microsoft.com/office/word/2010/wordml" xmlns:w15="http://schemas.microsoft.com/office/word/2012/wordml" xmlns:w16cex="http://schemas.microsoft.com/office/word/2018/wordml/cex" xmlns:w16cid="http://schemas.microsoft.com/office/word/2016/wordml/cid" xmlns:w16="http://schemas.microsoft.com/office/word/2018/wordml" xmlns:w16du="http://schemas.microsoft.com/office/word/2023/wordml/word16du" xmlns:w16sdtdh="http://schemas.microsoft.com/office/word/2020/wordml/sdtdatahash" xmlns:w16sdtfl="http://schemas.microsoft.com/office/word/2024/wordml/sdtformatlock" xmlns:w16se="http://schemas.microsoft.com/office/word/2015/wordml/symex" xmlns:wpg="http://schemas.microsoft.com/office/word/2010/wordprocessingGroup" xmlns:wpi="http://schemas.microsoft.com/office/word/2010/wordprocessingInk" xmlns:wne="http://schemas.microsoft.com/office/word/2006/wordml" xmlns:wps="http://schemas.microsoft.com/office/word/2010/wordprocessingShape" mc:Ignorable="w14 w15 w16se w16cid w16 w16cex w16sdtdh w16sdtfl w16du wp14">
   <w:abstractNum w:abstractNumId="0" w15:restartNumberingAfterBreak="0">
+    <w:nsid w:val="16805201"/>
+    <w:multiLevelType w:val="multilevel"/>
+    <w:tmpl w:val="5244880C"/>
+    <w:lvl w:ilvl="0">
+      <w:start w:val="1"/>
+      <w:numFmt w:val="bullet"/>
+      <w:lvlText w:val=""/>
+      <w:lvlJc w:val="left"/>
+      <w:pPr>
+        <w:tabs>
+          <w:tab w:val="num" w:pos="720"/>
+        </w:tabs>
+        <w:ind w:left="720" w:hanging="360"/>
+      </w:pPr>
+      <w:rPr>
+        <w:rFonts w:ascii="Symbol" w:hAnsi="Symbol" w:hint="default"/>
+        <w:sz w:val="20"/>
+      </w:rPr>
+    </w:lvl>
+    <w:lvl w:ilvl="1" w:tentative="1">
+      <w:start w:val="1"/>
+      <w:numFmt w:val="bullet"/>
+      <w:lvlText w:val="o"/>
+      <w:lvlJc w:val="left"/>
+      <w:pPr>
+        <w:tabs>
+          <w:tab w:val="num" w:pos="1440"/>
+        </w:tabs>
+        <w:ind w:left="1440" w:hanging="360"/>
+      </w:pPr>
+      <w:rPr>
+        <w:rFonts w:ascii="Courier New" w:hAnsi="Courier New" w:hint="default"/>
+        <w:sz w:val="20"/>
+      </w:rPr>
+    </w:lvl>
+    <w:lvl w:ilvl="2" w:tentative="1">
+      <w:start w:val="1"/>
+      <w:numFmt w:val="bullet"/>
+      <w:lvlText w:val=""/>
+      <w:lvlJc w:val="left"/>
+      <w:pPr>
+        <w:tabs>
+          <w:tab w:val="num" w:pos="2160"/>
+        </w:tabs>
+        <w:ind w:left="2160" w:hanging="360"/>
+      </w:pPr>
+      <w:rPr>
+        <w:rFonts w:ascii="Wingdings" w:hAnsi="Wingdings" w:hint="default"/>
+        <w:sz w:val="20"/>
+      </w:rPr>
+    </w:lvl>
+    <w:lvl w:ilvl="3" w:tentative="1">
+      <w:start w:val="1"/>
+      <w:numFmt w:val="bullet"/>
+      <w:lvlText w:val=""/>
+      <w:lvlJc w:val="left"/>
+      <w:pPr>
+        <w:tabs>
+          <w:tab w:val="num" w:pos="2880"/>
+        </w:tabs>
+        <w:ind w:left="2880" w:hanging="360"/>
+      </w:pPr>
+      <w:rPr>
+        <w:rFonts w:ascii="Wingdings" w:hAnsi="Wingdings" w:hint="default"/>
+        <w:sz w:val="20"/>
+      </w:rPr>
+    </w:lvl>
+    <w:lvl w:ilvl="4" w:tentative="1">
+      <w:start w:val="1"/>
+      <w:numFmt w:val="bullet"/>
+      <w:lvlText w:val=""/>
+      <w:lvlJc w:val="left"/>
+      <w:pPr>
+        <w:tabs>
+          <w:tab w:val="num" w:pos="3600"/>
+        </w:tabs>
+        <w:ind w:left="3600" w:hanging="360"/>
+      </w:pPr>
+      <w:rPr>
+        <w:rFonts w:ascii="Wingdings" w:hAnsi="Wingdings" w:hint="default"/>
+        <w:sz w:val="20"/>
+      </w:rPr>
+    </w:lvl>
+    <w:lvl w:ilvl="5" w:tentative="1">
+      <w:start w:val="1"/>
+      <w:numFmt w:val="bullet"/>
+      <w:lvlText w:val=""/>
+      <w:lvlJc w:val="left"/>
+      <w:pPr>
+        <w:tabs>
+          <w:tab w:val="num" w:pos="4320"/>
+        </w:tabs>
+        <w:ind w:left="4320" w:hanging="360"/>
+      </w:pPr>
+      <w:rPr>
+        <w:rFonts w:ascii="Wingdings" w:hAnsi="Wingdings" w:hint="default"/>
+        <w:sz w:val="20"/>
+      </w:rPr>
+    </w:lvl>
+    <w:lvl w:ilvl="6" w:tentative="1">
+      <w:start w:val="1"/>
+      <w:numFmt w:val="bullet"/>
+      <w:lvlText w:val=""/>
+      <w:lvlJc w:val="left"/>
+      <w:pPr>
+        <w:tabs>
+          <w:tab w:val="num" w:pos="5040"/>
+        </w:tabs>
+        <w:ind w:left="5040" w:hanging="360"/>
+      </w:pPr>
+      <w:rPr>
+        <w:rFonts w:ascii="Wingdings" w:hAnsi="Wingdings" w:hint="default"/>
+        <w:sz w:val="20"/>
+      </w:rPr>
+    </w:lvl>
+    <w:lvl w:ilvl="7" w:tentative="1">
+      <w:start w:val="1"/>
+      <w:numFmt w:val="bullet"/>
+      <w:lvlText w:val=""/>
+      <w:lvlJc w:val="left"/>
+      <w:pPr>
+        <w:tabs>
+          <w:tab w:val="num" w:pos="5760"/>
+        </w:tabs>
+        <w:ind w:left="5760" w:hanging="360"/>
+      </w:pPr>
+      <w:rPr>
+        <w:rFonts w:ascii="Wingdings" w:hAnsi="Wingdings" w:hint="default"/>
+        <w:sz w:val="20"/>
+      </w:rPr>
+    </w:lvl>
+    <w:lvl w:ilvl="8" w:tentative="1">
+      <w:start w:val="1"/>
+      <w:numFmt w:val="bullet"/>
+      <w:lvlText w:val=""/>
+      <w:lvlJc w:val="left"/>
+      <w:pPr>
+        <w:tabs>
+          <w:tab w:val="num" w:pos="6480"/>
+        </w:tabs>
+        <w:ind w:left="6480" w:hanging="360"/>
+      </w:pPr>
+      <w:rPr>
+        <w:rFonts w:ascii="Wingdings" w:hAnsi="Wingdings" w:hint="default"/>
+        <w:sz w:val="20"/>
+      </w:rPr>
+    </w:lvl>
+  </w:abstractNum>
+  <w:abstractNum w:abstractNumId="1" w15:restartNumberingAfterBreak="0">
+    <w:nsid w:val="1A0F73FD"/>
+    <w:multiLevelType w:val="multilevel"/>
+    <w:tmpl w:val="119CD054"/>
+    <w:lvl w:ilvl="0">
+      <w:start w:val="1"/>
+      <w:numFmt w:val="bullet"/>
+      <w:lvlText w:val=""/>
+      <w:lvlJc w:val="left"/>
+      <w:pPr>
+        <w:tabs>
+          <w:tab w:val="num" w:pos="720"/>
+        </w:tabs>
+        <w:ind w:left="720" w:hanging="360"/>
+      </w:pPr>
+      <w:rPr>
+        <w:rFonts w:ascii="Symbol" w:hAnsi="Symbol" w:hint="default"/>
+        <w:sz w:val="20"/>
+      </w:rPr>
+    </w:lvl>
+    <w:lvl w:ilvl="1" w:tentative="1">
+      <w:start w:val="1"/>
+      <w:numFmt w:val="bullet"/>
+      <w:lvlText w:val="o"/>
+      <w:lvlJc w:val="left"/>
+      <w:pPr>
+        <w:tabs>
+          <w:tab w:val="num" w:pos="1440"/>
+        </w:tabs>
+        <w:ind w:left="1440" w:hanging="360"/>
+      </w:pPr>
+      <w:rPr>
+        <w:rFonts w:ascii="Courier New" w:hAnsi="Courier New" w:hint="default"/>
+        <w:sz w:val="20"/>
+      </w:rPr>
+    </w:lvl>
+    <w:lvl w:ilvl="2" w:tentative="1">
+      <w:start w:val="1"/>
+      <w:numFmt w:val="bullet"/>
+      <w:lvlText w:val=""/>
+      <w:lvlJc w:val="left"/>
+      <w:pPr>
+        <w:tabs>
+          <w:tab w:val="num" w:pos="2160"/>
+        </w:tabs>
+        <w:ind w:left="2160" w:hanging="360"/>
+      </w:pPr>
+      <w:rPr>
+        <w:rFonts w:ascii="Wingdings" w:hAnsi="Wingdings" w:hint="default"/>
+        <w:sz w:val="20"/>
+      </w:rPr>
+    </w:lvl>
+    <w:lvl w:ilvl="3" w:tentative="1">
+      <w:start w:val="1"/>
+      <w:numFmt w:val="bullet"/>
+      <w:lvlText w:val=""/>
+      <w:lvlJc w:val="left"/>
+      <w:pPr>
+        <w:tabs>
+          <w:tab w:val="num" w:pos="2880"/>
+        </w:tabs>
+        <w:ind w:left="2880" w:hanging="360"/>
+      </w:pPr>
+      <w:rPr>
+        <w:rFonts w:ascii="Wingdings" w:hAnsi="Wingdings" w:hint="default"/>
+        <w:sz w:val="20"/>
+      </w:rPr>
+    </w:lvl>
+    <w:lvl w:ilvl="4" w:tentative="1">
+      <w:start w:val="1"/>
+      <w:numFmt w:val="bullet"/>
+      <w:lvlText w:val=""/>
+      <w:lvlJc w:val="left"/>
+      <w:pPr>
+        <w:tabs>
+          <w:tab w:val="num" w:pos="3600"/>
+        </w:tabs>
+        <w:ind w:left="3600" w:hanging="360"/>
+      </w:pPr>
+      <w:rPr>
+        <w:rFonts w:ascii="Wingdings" w:hAnsi="Wingdings" w:hint="default"/>
+        <w:sz w:val="20"/>
+      </w:rPr>
+    </w:lvl>
+    <w:lvl w:ilvl="5" w:tentative="1">
+      <w:start w:val="1"/>
+      <w:numFmt w:val="bullet"/>
+      <w:lvlText w:val=""/>
+      <w:lvlJc w:val="left"/>
+      <w:pPr>
+        <w:tabs>
+          <w:tab w:val="num" w:pos="4320"/>
+        </w:tabs>
+        <w:ind w:left="4320" w:hanging="360"/>
+      </w:pPr>
+      <w:rPr>
+        <w:rFonts w:ascii="Wingdings" w:hAnsi="Wingdings" w:hint="default"/>
+        <w:sz w:val="20"/>
+      </w:rPr>
+    </w:lvl>
+    <w:lvl w:ilvl="6" w:tentative="1">
+      <w:start w:val="1"/>
+      <w:numFmt w:val="bullet"/>
+      <w:lvlText w:val=""/>
+      <w:lvlJc w:val="left"/>
+      <w:pPr>
+        <w:tabs>
+          <w:tab w:val="num" w:pos="5040"/>
+        </w:tabs>
+        <w:ind w:left="5040" w:hanging="360"/>
+      </w:pPr>
+      <w:rPr>
+        <w:rFonts w:ascii="Wingdings" w:hAnsi="Wingdings" w:hint="default"/>
+        <w:sz w:val="20"/>
+      </w:rPr>
+    </w:lvl>
+    <w:lvl w:ilvl="7" w:tentative="1">
+      <w:start w:val="1"/>
+      <w:numFmt w:val="bullet"/>
+      <w:lvlText w:val=""/>
+      <w:lvlJc w:val="left"/>
+      <w:pPr>
+        <w:tabs>
+          <w:tab w:val="num" w:pos="5760"/>
+        </w:tabs>
+        <w:ind w:left="5760" w:hanging="360"/>
+      </w:pPr>
+      <w:rPr>
+        <w:rFonts w:ascii="Wingdings" w:hAnsi="Wingdings" w:hint="default"/>
+        <w:sz w:val="20"/>
+      </w:rPr>
+    </w:lvl>
+    <w:lvl w:ilvl="8" w:tentative="1">
+      <w:start w:val="1"/>
+      <w:numFmt w:val="bullet"/>
+      <w:lvlText w:val=""/>
+      <w:lvlJc w:val="left"/>
+      <w:pPr>
+        <w:tabs>
+          <w:tab w:val="num" w:pos="6480"/>
+        </w:tabs>
+        <w:ind w:left="6480" w:hanging="360"/>
+      </w:pPr>
+      <w:rPr>
+        <w:rFonts w:ascii="Wingdings" w:hAnsi="Wingdings" w:hint="default"/>
+        <w:sz w:val="20"/>
+      </w:rPr>
+    </w:lvl>
+  </w:abstractNum>
+  <w:abstractNum w:abstractNumId="2" w15:restartNumberingAfterBreak="0">
     <w:nsid w:val="2707704E"/>
     <w:multiLevelType w:val="hybridMultilevel"/>
     <w:tmpl w:val="50FC5948"/>
@@ -1420,7 +2888,120 @@
       <w:lvlJc w:val="left"/>
     </w:lvl>
   </w:abstractNum>
-  <w:abstractNum w:abstractNumId="1" w15:restartNumberingAfterBreak="0">
+  <w:abstractNum w:abstractNumId="3" w15:restartNumberingAfterBreak="0">
+    <w:nsid w:val="2DDE6B04"/>
+    <w:multiLevelType w:val="multilevel"/>
+    <w:tmpl w:val="AD5AD944"/>
+    <w:lvl w:ilvl="0">
+      <w:start w:val="1"/>
+      <w:numFmt w:val="decimal"/>
+      <w:lvlText w:val="%1."/>
+      <w:lvlJc w:val="left"/>
+      <w:pPr>
+        <w:tabs>
+          <w:tab w:val="num" w:pos="720"/>
+        </w:tabs>
+        <w:ind w:left="720" w:hanging="360"/>
+      </w:pPr>
+    </w:lvl>
+    <w:lvl w:ilvl="1" w:tentative="1">
+      <w:start w:val="1"/>
+      <w:numFmt w:val="decimal"/>
+      <w:lvlText w:val="%2."/>
+      <w:lvlJc w:val="left"/>
+      <w:pPr>
+        <w:tabs>
+          <w:tab w:val="num" w:pos="1440"/>
+        </w:tabs>
+        <w:ind w:left="1440" w:hanging="360"/>
+      </w:pPr>
+    </w:lvl>
+    <w:lvl w:ilvl="2" w:tentative="1">
+      <w:start w:val="1"/>
+      <w:numFmt w:val="decimal"/>
+      <w:lvlText w:val="%3."/>
+      <w:lvlJc w:val="left"/>
+      <w:pPr>
+        <w:tabs>
+          <w:tab w:val="num" w:pos="2160"/>
+        </w:tabs>
+        <w:ind w:left="2160" w:hanging="360"/>
+      </w:pPr>
+    </w:lvl>
+    <w:lvl w:ilvl="3" w:tentative="1">
+      <w:start w:val="1"/>
+      <w:numFmt w:val="decimal"/>
+      <w:lvlText w:val="%4."/>
+      <w:lvlJc w:val="left"/>
+      <w:pPr>
+        <w:tabs>
+          <w:tab w:val="num" w:pos="2880"/>
+        </w:tabs>
+        <w:ind w:left="2880" w:hanging="360"/>
+      </w:pPr>
+    </w:lvl>
+    <w:lvl w:ilvl="4" w:tentative="1">
+      <w:start w:val="1"/>
+      <w:numFmt w:val="decimal"/>
+      <w:lvlText w:val="%5."/>
+      <w:lvlJc w:val="left"/>
+      <w:pPr>
+        <w:tabs>
+          <w:tab w:val="num" w:pos="3600"/>
+        </w:tabs>
+        <w:ind w:left="3600" w:hanging="360"/>
+      </w:pPr>
+    </w:lvl>
+    <w:lvl w:ilvl="5" w:tentative="1">
+      <w:start w:val="1"/>
+      <w:numFmt w:val="decimal"/>
+      <w:lvlText w:val="%6."/>
+      <w:lvlJc w:val="left"/>
+      <w:pPr>
+        <w:tabs>
+          <w:tab w:val="num" w:pos="4320"/>
+        </w:tabs>
+        <w:ind w:left="4320" w:hanging="360"/>
+      </w:pPr>
+    </w:lvl>
+    <w:lvl w:ilvl="6" w:tentative="1">
+      <w:start w:val="1"/>
+      <w:numFmt w:val="decimal"/>
+      <w:lvlText w:val="%7."/>
+      <w:lvlJc w:val="left"/>
+      <w:pPr>
+        <w:tabs>
+          <w:tab w:val="num" w:pos="5040"/>
+        </w:tabs>
+        <w:ind w:left="5040" w:hanging="360"/>
+      </w:pPr>
+    </w:lvl>
+    <w:lvl w:ilvl="7" w:tentative="1">
+      <w:start w:val="1"/>
+      <w:numFmt w:val="decimal"/>
+      <w:lvlText w:val="%8."/>
+      <w:lvlJc w:val="left"/>
+      <w:pPr>
+        <w:tabs>
+          <w:tab w:val="num" w:pos="5760"/>
+        </w:tabs>
+        <w:ind w:left="5760" w:hanging="360"/>
+      </w:pPr>
+    </w:lvl>
+    <w:lvl w:ilvl="8" w:tentative="1">
+      <w:start w:val="1"/>
+      <w:numFmt w:val="decimal"/>
+      <w:lvlText w:val="%9."/>
+      <w:lvlJc w:val="left"/>
+      <w:pPr>
+        <w:tabs>
+          <w:tab w:val="num" w:pos="6480"/>
+        </w:tabs>
+        <w:ind w:left="6480" w:hanging="360"/>
+      </w:pPr>
+    </w:lvl>
+  </w:abstractNum>
+  <w:abstractNum w:abstractNumId="4" w15:restartNumberingAfterBreak="0">
     <w:nsid w:val="4050042F"/>
     <w:multiLevelType w:val="hybridMultilevel"/>
     <w:tmpl w:val="9CD416A8"/>
@@ -1506,7 +3087,120 @@
       </w:pPr>
     </w:lvl>
   </w:abstractNum>
-  <w:abstractNum w:abstractNumId="2" w15:restartNumberingAfterBreak="0">
+  <w:abstractNum w:abstractNumId="5" w15:restartNumberingAfterBreak="0">
+    <w:nsid w:val="59E90B29"/>
+    <w:multiLevelType w:val="multilevel"/>
+    <w:tmpl w:val="CC04296C"/>
+    <w:lvl w:ilvl="0">
+      <w:start w:val="1"/>
+      <w:numFmt w:val="decimal"/>
+      <w:lvlText w:val="%1."/>
+      <w:lvlJc w:val="left"/>
+      <w:pPr>
+        <w:tabs>
+          <w:tab w:val="num" w:pos="720"/>
+        </w:tabs>
+        <w:ind w:left="720" w:hanging="360"/>
+      </w:pPr>
+    </w:lvl>
+    <w:lvl w:ilvl="1" w:tentative="1">
+      <w:start w:val="1"/>
+      <w:numFmt w:val="decimal"/>
+      <w:lvlText w:val="%2."/>
+      <w:lvlJc w:val="left"/>
+      <w:pPr>
+        <w:tabs>
+          <w:tab w:val="num" w:pos="1440"/>
+        </w:tabs>
+        <w:ind w:left="1440" w:hanging="360"/>
+      </w:pPr>
+    </w:lvl>
+    <w:lvl w:ilvl="2" w:tentative="1">
+      <w:start w:val="1"/>
+      <w:numFmt w:val="decimal"/>
+      <w:lvlText w:val="%3."/>
+      <w:lvlJc w:val="left"/>
+      <w:pPr>
+        <w:tabs>
+          <w:tab w:val="num" w:pos="2160"/>
+        </w:tabs>
+        <w:ind w:left="2160" w:hanging="360"/>
+      </w:pPr>
+    </w:lvl>
+    <w:lvl w:ilvl="3" w:tentative="1">
+      <w:start w:val="1"/>
+      <w:numFmt w:val="decimal"/>
+      <w:lvlText w:val="%4."/>
+      <w:lvlJc w:val="left"/>
+      <w:pPr>
+        <w:tabs>
+          <w:tab w:val="num" w:pos="2880"/>
+        </w:tabs>
+        <w:ind w:left="2880" w:hanging="360"/>
+      </w:pPr>
+    </w:lvl>
+    <w:lvl w:ilvl="4" w:tentative="1">
+      <w:start w:val="1"/>
+      <w:numFmt w:val="decimal"/>
+      <w:lvlText w:val="%5."/>
+      <w:lvlJc w:val="left"/>
+      <w:pPr>
+        <w:tabs>
+          <w:tab w:val="num" w:pos="3600"/>
+        </w:tabs>
+        <w:ind w:left="3600" w:hanging="360"/>
+      </w:pPr>
+    </w:lvl>
+    <w:lvl w:ilvl="5" w:tentative="1">
+      <w:start w:val="1"/>
+      <w:numFmt w:val="decimal"/>
+      <w:lvlText w:val="%6."/>
+      <w:lvlJc w:val="left"/>
+      <w:pPr>
+        <w:tabs>
+          <w:tab w:val="num" w:pos="4320"/>
+        </w:tabs>
+        <w:ind w:left="4320" w:hanging="360"/>
+      </w:pPr>
+    </w:lvl>
+    <w:lvl w:ilvl="6" w:tentative="1">
+      <w:start w:val="1"/>
+      <w:numFmt w:val="decimal"/>
+      <w:lvlText w:val="%7."/>
+      <w:lvlJc w:val="left"/>
+      <w:pPr>
+        <w:tabs>
+          <w:tab w:val="num" w:pos="5040"/>
+        </w:tabs>
+        <w:ind w:left="5040" w:hanging="360"/>
+      </w:pPr>
+    </w:lvl>
+    <w:lvl w:ilvl="7" w:tentative="1">
+      <w:start w:val="1"/>
+      <w:numFmt w:val="decimal"/>
+      <w:lvlText w:val="%8."/>
+      <w:lvlJc w:val="left"/>
+      <w:pPr>
+        <w:tabs>
+          <w:tab w:val="num" w:pos="5760"/>
+        </w:tabs>
+        <w:ind w:left="5760" w:hanging="360"/>
+      </w:pPr>
+    </w:lvl>
+    <w:lvl w:ilvl="8" w:tentative="1">
+      <w:start w:val="1"/>
+      <w:numFmt w:val="decimal"/>
+      <w:lvlText w:val="%9."/>
+      <w:lvlJc w:val="left"/>
+      <w:pPr>
+        <w:tabs>
+          <w:tab w:val="num" w:pos="6480"/>
+        </w:tabs>
+        <w:ind w:left="6480" w:hanging="360"/>
+      </w:pPr>
+    </w:lvl>
+  </w:abstractNum>
+  <w:abstractNum w:abstractNumId="6" w15:restartNumberingAfterBreak="0">
     <w:nsid w:val="77FC458D"/>
     <w:multiLevelType w:val="multilevel"/>
     <w:tmpl w:val="B666E0A2"/>
@@ -1593,22 +3287,34 @@
     </w:lvl>
   </w:abstractNum>
   <w:num w:numId="1" w16cid:durableId="346642297">
-    <w:abstractNumId w:val="1"/>
+    <w:abstractNumId w:val="4"/>
     <w:lvlOverride w:ilvl="0">
       <w:startOverride w:val="1"/>
     </w:lvlOverride>
   </w:num>
   <w:num w:numId="2" w16cid:durableId="2105151914">
-    <w:abstractNumId w:val="0"/>
+    <w:abstractNumId w:val="2"/>
     <w:lvlOverride w:ilvl="0">
       <w:startOverride w:val="1"/>
     </w:lvlOverride>
   </w:num>
   <w:num w:numId="3" w16cid:durableId="1883518571">
-    <w:abstractNumId w:val="2"/>
+    <w:abstractNumId w:val="6"/>
     <w:lvlOverride w:ilvl="0">
       <w:startOverride w:val="1"/>
     </w:lvlOverride>
+  </w:num>
+  <w:num w:numId="4" w16cid:durableId="1117722875">
+    <w:abstractNumId w:val="5"/>
+  </w:num>
+  <w:num w:numId="5" w16cid:durableId="1888712488">
+    <w:abstractNumId w:val="1"/>
+  </w:num>
+  <w:num w:numId="6" w16cid:durableId="1325547162">
+    <w:abstractNumId w:val="3"/>
+  </w:num>
+  <w:num w:numId="7" w16cid:durableId="1554537311">
+    <w:abstractNumId w:val="0"/>
   </w:num>
 </w:numbering>
 </file>
@@ -2091,7 +3797,6 @@
   <w:style w:type="character" w:default="1" w:styleId="Fontepargpadro">
     <w:name w:val="Default Paragraph Font"/>
     <w:uiPriority w:val="1"/>
-    <w:semiHidden/>
     <w:unhideWhenUsed/>
   </w:style>
   <w:style w:type="table" w:default="1" w:styleId="Tabelanormal">

</xml_diff>